<commit_message>
small updates on docs and class
</commit_message>
<xml_diff>
--- a/docs/Architecture Decision Record.docx
+++ b/docs/Architecture Decision Record.docx
@@ -2163,15 +2163,7 @@
         <w:pStyle w:val="ListBullet"/>
       </w:pPr>
       <w:r>
-        <w:t xml:space="preserve">Ability to expand staff and triage </w:t>
-      </w:r>
-      <w:proofErr w:type="gramStart"/>
-      <w:r>
-        <w:t>workflows later</w:t>
-      </w:r>
-      <w:proofErr w:type="gramEnd"/>
-      <w:r>
-        <w:t>.</w:t>
+        <w:t>Ability to expand staff and triage workflows later.</w:t>
       </w:r>
     </w:p>
     <w:p>
@@ -2258,7 +2250,7 @@
           <w:b/>
           <w:bCs/>
         </w:rPr>
-        <w:t>Positive sides</w:t>
+        <w:t>Key Strengths</w:t>
       </w:r>
     </w:p>
     <w:p>
@@ -2289,7 +2281,7 @@
           <w:b/>
           <w:bCs/>
         </w:rPr>
-        <w:t>Negative sides</w:t>
+        <w:t>Weaknesses</w:t>
       </w:r>
     </w:p>
     <w:p>
@@ -2389,48 +2381,52 @@
           <w:b/>
           <w:bCs/>
         </w:rPr>
-        <w:t xml:space="preserve">Why </w:t>
-      </w:r>
-      <w:proofErr w:type="gramStart"/>
+        <w:t xml:space="preserve">Why it is the right choice for </w:t>
+      </w:r>
+      <w:proofErr w:type="spellStart"/>
       <w:r>
         <w:rPr>
           <w:b/>
           <w:bCs/>
         </w:rPr>
-        <w:t>it is</w:t>
-      </w:r>
-      <w:proofErr w:type="gramEnd"/>
-      <w:r>
+        <w:t>RightQueue</w:t>
+      </w:r>
+      <w:proofErr w:type="spellEnd"/>
+    </w:p>
+    <w:p>
+      <w:r>
+        <w:t>The MVP needs consistent request creation and routing across related records. One modular backend provides this with manageable student-level complexity.</w:t>
+      </w:r>
+    </w:p>
+    <w:p>
+      <w:pPr>
+        <w:pStyle w:val="Heading1"/>
+      </w:pPr>
+      <w:bookmarkStart w:id="4" w:name="_Toc241931946"/>
+      <w:r>
+        <w:t>5. Django for backend implementation</w:t>
+      </w:r>
+      <w:bookmarkEnd w:id="4"/>
+    </w:p>
+    <w:p>
+      <w:pPr>
         <w:rPr>
           <w:b/>
           <w:bCs/>
         </w:rPr>
-        <w:t xml:space="preserve"> the right choice for </w:t>
-      </w:r>
-      <w:proofErr w:type="spellStart"/>
+      </w:pPr>
       <w:r>
         <w:rPr>
           <w:b/>
           <w:bCs/>
         </w:rPr>
-        <w:t>RightQueue</w:t>
-      </w:r>
-      <w:proofErr w:type="spellEnd"/>
-    </w:p>
-    <w:p>
-      <w:r>
-        <w:t>The MVP needs consistent request creation and routing across related records. One modular backend provides this with manageable student-level complexity.</w:t>
-      </w:r>
-    </w:p>
-    <w:p>
-      <w:pPr>
-        <w:pStyle w:val="Heading1"/>
-      </w:pPr>
-      <w:bookmarkStart w:id="4" w:name="_Toc241931946"/>
-      <w:r>
-        <w:t>5. Django for backend implementation</w:t>
-      </w:r>
-      <w:bookmarkEnd w:id="4"/>
+        <w:t>Description</w:t>
+      </w:r>
+    </w:p>
+    <w:p>
+      <w:r>
+        <w:t xml:space="preserve">Django is the Python web framework providing the ORM, migrations, authentication, model validation, and administration. Domain apps use these integrated facilities. </w:t>
+      </w:r>
     </w:p>
     <w:p>
       <w:pPr>
@@ -2444,20 +2440,23 @@
           <w:b/>
           <w:bCs/>
         </w:rPr>
-        <w:t>Description</w:t>
-      </w:r>
-    </w:p>
-    <w:p>
-      <w:r>
-        <w:t xml:space="preserve">Django is the Python web framework providing </w:t>
-      </w:r>
-      <w:proofErr w:type="gramStart"/>
-      <w:r>
-        <w:t>the ORM</w:t>
-      </w:r>
-      <w:proofErr w:type="gramEnd"/>
-      <w:r>
-        <w:t xml:space="preserve">, migrations, authentication, model validation, and administration. Domain apps use these integrated facilities. </w:t>
+        <w:t>Key Strengths</w:t>
+      </w:r>
+    </w:p>
+    <w:p>
+      <w:pPr>
+        <w:pStyle w:val="ListBullet"/>
+      </w:pPr>
+      <w:r>
+        <w:t>Reduces setup work for accounts, relational models, and administration.</w:t>
+      </w:r>
+    </w:p>
+    <w:p>
+      <w:pPr>
+        <w:pStyle w:val="ListBullet"/>
+      </w:pPr>
+      <w:r>
+        <w:t>Gives organization, team, and request data a consistent structure.</w:t>
       </w:r>
     </w:p>
     <w:p>
@@ -2472,7 +2471,7 @@
           <w:b/>
           <w:bCs/>
         </w:rPr>
-        <w:t>Positive sides</w:t>
+        <w:t>Weaknesses</w:t>
       </w:r>
     </w:p>
     <w:p>
@@ -2480,7 +2479,7 @@
         <w:pStyle w:val="ListBullet"/>
       </w:pPr>
       <w:r>
-        <w:t>Reduces setup work for accounts, relational models, and administration.</w:t>
+        <w:t>Requires learning framework conventions and model lifecycle rules.</w:t>
       </w:r>
     </w:p>
     <w:p>
@@ -2488,7 +2487,7 @@
         <w:pStyle w:val="ListBullet"/>
       </w:pPr>
       <w:r>
-        <w:t>Gives organization, team, and request data a consistent structure.</w:t>
+        <w:t>Includes facilities beyond a small API's immediate needs.</w:t>
       </w:r>
     </w:p>
     <w:p>
@@ -2503,7 +2502,7 @@
           <w:b/>
           <w:bCs/>
         </w:rPr>
-        <w:t>Negative sides</w:t>
+        <w:t>Mitigation</w:t>
       </w:r>
     </w:p>
     <w:p>
@@ -2511,7 +2510,7 @@
         <w:pStyle w:val="ListBullet"/>
       </w:pPr>
       <w:r>
-        <w:t>Requires learning framework conventions and model lifecycle rules.</w:t>
+        <w:t>Use focused domain apps and existing model, API, and service tests.</w:t>
       </w:r>
     </w:p>
     <w:p>
@@ -2519,7 +2518,26 @@
         <w:pStyle w:val="ListBullet"/>
       </w:pPr>
       <w:r>
-        <w:t>Includes facilities beyond a small API's immediate needs.</w:t>
+        <w:t xml:space="preserve">Explicitly call </w:t>
+      </w:r>
+      <w:proofErr w:type="spellStart"/>
+      <w:r>
+        <w:rPr>
+          <w:rFonts w:ascii="Consolas" w:hAnsi="Consolas"/>
+          <w:sz w:val="19"/>
+        </w:rPr>
+        <w:t>full_clean</w:t>
+      </w:r>
+      <w:proofErr w:type="spellEnd"/>
+      <w:r>
+        <w:rPr>
+          <w:rFonts w:ascii="Consolas" w:hAnsi="Consolas"/>
+          <w:sz w:val="19"/>
+        </w:rPr>
+        <w:t>()</w:t>
+      </w:r>
+      <w:r>
+        <w:t xml:space="preserve"> in the submission service before saving validated workflow records.</w:t>
       </w:r>
     </w:p>
     <w:p>
@@ -2534,23 +2552,20 @@
           <w:b/>
           <w:bCs/>
         </w:rPr>
-        <w:t>Mitigation</w:t>
+        <w:t>Alternatives considered</w:t>
       </w:r>
     </w:p>
     <w:p>
       <w:pPr>
         <w:pStyle w:val="ListBullet"/>
       </w:pPr>
-      <w:r>
-        <w:t xml:space="preserve">Use focused domain apps and existing </w:t>
-      </w:r>
-      <w:proofErr w:type="gramStart"/>
-      <w:r>
-        <w:t>model</w:t>
-      </w:r>
-      <w:proofErr w:type="gramEnd"/>
-      <w:r>
-        <w:t>, API, and service tests.</w:t>
+      <w:proofErr w:type="spellStart"/>
+      <w:r>
+        <w:t>FastAPI</w:t>
+      </w:r>
+      <w:proofErr w:type="spellEnd"/>
+      <w:r>
+        <w:t xml:space="preserve"> is lightweight and well suited to API-first and asynchronous services; equivalent account, ORM, migration, and admin facilities require additional choices and integration.</w:t>
       </w:r>
     </w:p>
     <w:p>
@@ -2558,42 +2573,7 @@
         <w:pStyle w:val="ListBullet"/>
       </w:pPr>
       <w:r>
-        <w:t xml:space="preserve">Explicitly call </w:t>
-      </w:r>
-      <w:proofErr w:type="spellStart"/>
-      <w:r>
-        <w:rPr>
-          <w:rFonts w:ascii="Consolas" w:hAnsi="Consolas"/>
-          <w:sz w:val="19"/>
-        </w:rPr>
-        <w:t>full_</w:t>
-      </w:r>
-      <w:proofErr w:type="gramStart"/>
-      <w:r>
-        <w:rPr>
-          <w:rFonts w:ascii="Consolas" w:hAnsi="Consolas"/>
-          <w:sz w:val="19"/>
-        </w:rPr>
-        <w:t>clean</w:t>
-      </w:r>
-      <w:proofErr w:type="spellEnd"/>
-      <w:r>
-        <w:rPr>
-          <w:rFonts w:ascii="Consolas" w:hAnsi="Consolas"/>
-          <w:sz w:val="19"/>
-        </w:rPr>
-        <w:t>(</w:t>
-      </w:r>
-      <w:proofErr w:type="gramEnd"/>
-      <w:r>
-        <w:rPr>
-          <w:rFonts w:ascii="Consolas" w:hAnsi="Consolas"/>
-          <w:sz w:val="19"/>
-        </w:rPr>
-        <w:t>)</w:t>
-      </w:r>
-      <w:r>
-        <w:t xml:space="preserve"> in the submission service before saving validated workflow records.</w:t>
+        <w:t>Spring Boot offers a mature Java backend ecosystem but would replace the current Python implementation and its tests.</w:t>
       </w:r>
     </w:p>
     <w:p>
@@ -2608,84 +2588,91 @@
           <w:b/>
           <w:bCs/>
         </w:rPr>
-        <w:t>Alternatives considered</w:t>
-      </w:r>
-    </w:p>
-    <w:p>
-      <w:pPr>
-        <w:pStyle w:val="ListBullet"/>
-      </w:pPr>
+        <w:t xml:space="preserve">Why it is the right choice for </w:t>
+      </w:r>
       <w:proofErr w:type="spellStart"/>
       <w:r>
-        <w:t>FastAPI</w:t>
-      </w:r>
-      <w:proofErr w:type="spellEnd"/>
-      <w:r>
-        <w:t xml:space="preserve"> is lightweight and well suited to API-first and asynchronous services; equivalent account, ORM, migration, and admin facilities require additional choices and integration.</w:t>
-      </w:r>
-    </w:p>
-    <w:p>
-      <w:pPr>
-        <w:pStyle w:val="ListBullet"/>
-      </w:pPr>
-      <w:r>
-        <w:t>Spring Boot offers a mature Java backend ecosystem but would replace the current Python implementation and its tests.</w:t>
-      </w:r>
-    </w:p>
-    <w:p>
-      <w:pPr>
         <w:rPr>
           <w:b/>
           <w:bCs/>
         </w:rPr>
-      </w:pPr>
-      <w:r>
+        <w:t>RightQueue</w:t>
+      </w:r>
+      <w:proofErr w:type="spellEnd"/>
+    </w:p>
+    <w:p>
+      <w:r>
+        <w:t>Django's integrated features reduce setup work for a relational workflow MVP and let a student focus on membership rules, request routing, and correctness.</w:t>
+      </w:r>
+    </w:p>
+    <w:p>
+      <w:pPr>
+        <w:pStyle w:val="Heading1"/>
+      </w:pPr>
+      <w:bookmarkStart w:id="5" w:name="_Toc241931947"/>
+      <w:r>
+        <w:t>6. Django REST Framework for the API</w:t>
+      </w:r>
+      <w:bookmarkEnd w:id="5"/>
+    </w:p>
+    <w:p>
+      <w:pPr>
         <w:rPr>
           <w:b/>
           <w:bCs/>
         </w:rPr>
-        <w:t xml:space="preserve">Why </w:t>
-      </w:r>
-      <w:proofErr w:type="gramStart"/>
+      </w:pPr>
       <w:r>
         <w:rPr>
           <w:b/>
           <w:bCs/>
         </w:rPr>
-        <w:t>it is</w:t>
-      </w:r>
-      <w:proofErr w:type="gramEnd"/>
-      <w:r>
+        <w:t>Description</w:t>
+      </w:r>
+    </w:p>
+    <w:p>
+      <w:r>
+        <w:t xml:space="preserve">Django REST Framework (DRF) is a Django API toolkit. </w:t>
+      </w:r>
+      <w:proofErr w:type="spellStart"/>
+      <w:r>
+        <w:t>RightQueue</w:t>
+      </w:r>
+      <w:proofErr w:type="spellEnd"/>
+      <w:r>
+        <w:t xml:space="preserve"> uses API views, serializers, permissions, and session authentication for JSON endpoints. </w:t>
+      </w:r>
+    </w:p>
+    <w:p>
+      <w:pPr>
         <w:rPr>
           <w:b/>
           <w:bCs/>
         </w:rPr>
-        <w:t xml:space="preserve"> the right choice for </w:t>
-      </w:r>
-      <w:proofErr w:type="spellStart"/>
+      </w:pPr>
       <w:r>
         <w:rPr>
           <w:b/>
           <w:bCs/>
         </w:rPr>
-        <w:t>RightQueue</w:t>
-      </w:r>
-      <w:proofErr w:type="spellEnd"/>
-    </w:p>
-    <w:p>
-      <w:r>
-        <w:t>Django's integrated features reduce setup work for a relational workflow MVP and let a student focus on membership rules, request routing, and correctness.</w:t>
-      </w:r>
-    </w:p>
-    <w:p>
-      <w:pPr>
-        <w:pStyle w:val="Heading1"/>
-      </w:pPr>
-      <w:bookmarkStart w:id="5" w:name="_Toc241931947"/>
-      <w:r>
-        <w:t>6. Django REST Framework for the API</w:t>
-      </w:r>
-      <w:bookmarkEnd w:id="5"/>
+        <w:t>Key Strengths</w:t>
+      </w:r>
+    </w:p>
+    <w:p>
+      <w:pPr>
+        <w:pStyle w:val="ListBullet"/>
+      </w:pPr>
+      <w:r>
+        <w:t>Separates browser presentation from backend validation and workflow rules.</w:t>
+      </w:r>
+    </w:p>
+    <w:p>
+      <w:pPr>
+        <w:pStyle w:val="ListBullet"/>
+      </w:pPr>
+      <w:r>
+        <w:t>Reuses Django authentication and ORM integration.</w:t>
+      </w:r>
     </w:p>
     <w:p>
       <w:pPr>
@@ -2699,263 +2686,161 @@
           <w:b/>
           <w:bCs/>
         </w:rPr>
+        <w:t>Weaknesses</w:t>
+      </w:r>
+    </w:p>
+    <w:p>
+      <w:pPr>
+        <w:pStyle w:val="ListBullet"/>
+      </w:pPr>
+      <w:r>
+        <w:t>Adds API concepts and serializer maintenance.</w:t>
+      </w:r>
+    </w:p>
+    <w:p>
+      <w:pPr>
+        <w:pStyle w:val="ListBullet"/>
+      </w:pPr>
+      <w:r>
+        <w:t>Default authentication does not automatically enforce organization boundaries.</w:t>
+      </w:r>
+    </w:p>
+    <w:p>
+      <w:pPr>
+        <w:rPr>
+          <w:b/>
+          <w:bCs/>
+        </w:rPr>
+      </w:pPr>
+      <w:r>
+        <w:rPr>
+          <w:b/>
+          <w:bCs/>
+        </w:rPr>
+        <w:t>Mitigation</w:t>
+      </w:r>
+    </w:p>
+    <w:p>
+      <w:pPr>
+        <w:pStyle w:val="ListBullet"/>
+      </w:pPr>
+      <w:r>
+        <w:t>Existing views check active organization membership; submission checks the requester role and related organization data.</w:t>
+      </w:r>
+    </w:p>
+    <w:p>
+      <w:pPr>
+        <w:pStyle w:val="ListBullet"/>
+      </w:pPr>
+      <w:r>
+        <w:t>API tests cover access restrictions and invalid input.</w:t>
+      </w:r>
+    </w:p>
+    <w:p>
+      <w:pPr>
+        <w:rPr>
+          <w:b/>
+          <w:bCs/>
+        </w:rPr>
+      </w:pPr>
+      <w:r>
+        <w:rPr>
+          <w:b/>
+          <w:bCs/>
+        </w:rPr>
+        <w:t>Alternatives considered</w:t>
+      </w:r>
+    </w:p>
+    <w:p>
+      <w:pPr>
+        <w:pStyle w:val="ListBullet"/>
+      </w:pPr>
+      <w:r>
+        <w:t>Plain Django JSON views reduce dependencies but require more manual request validation and response handling.</w:t>
+      </w:r>
+    </w:p>
+    <w:p>
+      <w:pPr>
+        <w:pStyle w:val="ListBullet"/>
+      </w:pPr>
+      <w:proofErr w:type="spellStart"/>
+      <w:r>
+        <w:lastRenderedPageBreak/>
+        <w:t>GraphQL</w:t>
+      </w:r>
+      <w:proofErr w:type="spellEnd"/>
+      <w:r>
+        <w:t xml:space="preserve"> supports flexible client queries but adds schema and authorization complexity for these focused endpoints.</w:t>
+      </w:r>
+    </w:p>
+    <w:p>
+      <w:pPr>
+        <w:rPr>
+          <w:b/>
+          <w:bCs/>
+        </w:rPr>
+      </w:pPr>
+      <w:r>
+        <w:rPr>
+          <w:b/>
+          <w:bCs/>
+        </w:rPr>
+        <w:t xml:space="preserve">Why it is the right choice for </w:t>
+      </w:r>
+      <w:proofErr w:type="spellStart"/>
+      <w:r>
+        <w:rPr>
+          <w:b/>
+          <w:bCs/>
+        </w:rPr>
+        <w:t>RightQueue</w:t>
+      </w:r>
+      <w:proofErr w:type="spellEnd"/>
+    </w:p>
+    <w:p>
+      <w:r>
+        <w:t>The frontend needs a small, explicit interface for login, services, and request creation while the backend remains responsible for permissions and data rules.</w:t>
+      </w:r>
+    </w:p>
+    <w:p>
+      <w:pPr>
+        <w:pStyle w:val="Heading1"/>
+      </w:pPr>
+      <w:bookmarkStart w:id="6" w:name="_Toc241931948"/>
+      <w:r>
+        <w:t>7. PostgreSQL for the database</w:t>
+      </w:r>
+      <w:bookmarkEnd w:id="6"/>
+    </w:p>
+    <w:p>
+      <w:pPr>
+        <w:rPr>
+          <w:b/>
+          <w:bCs/>
+        </w:rPr>
+      </w:pPr>
+      <w:r>
+        <w:rPr>
+          <w:b/>
+          <w:bCs/>
+        </w:rPr>
         <w:t>Description</w:t>
       </w:r>
     </w:p>
     <w:p>
       <w:r>
-        <w:t xml:space="preserve">Django REST Framework (DRF) is a Django API toolkit. </w:t>
-      </w:r>
-      <w:proofErr w:type="spellStart"/>
-      <w:r>
-        <w:t>RightQueue</w:t>
-      </w:r>
-      <w:proofErr w:type="spellEnd"/>
-      <w:r>
-        <w:t xml:space="preserve"> uses API views, serializers, permissions, and session authentication for JSON endpoints. See </w:t>
+        <w:t>PostgreSQL is the relational database selected by the</w:t>
+      </w:r>
+      <w:r>
+        <w:rPr>
+          <w:color w:val="auto"/>
+        </w:rPr>
+        <w:t xml:space="preserve"> </w:t>
       </w:r>
       <w:hyperlink r:id="rId9">
         <w:r>
           <w:rPr>
-            <w:color w:val="24527A"/>
-          </w:rPr>
-          <w:t>API routes</w:t>
-        </w:r>
-      </w:hyperlink>
-      <w:r>
-        <w:t xml:space="preserve">, </w:t>
-      </w:r>
-      <w:hyperlink r:id="rId10">
-        <w:r>
-          <w:rPr>
-            <w:color w:val="24527A"/>
-          </w:rPr>
-          <w:t>request view</w:t>
-        </w:r>
-      </w:hyperlink>
-      <w:r>
-        <w:t xml:space="preserve">, and </w:t>
-      </w:r>
-      <w:hyperlink r:id="rId11">
-        <w:r>
-          <w:rPr>
-            <w:color w:val="24527A"/>
-          </w:rPr>
-          <w:t>serializers</w:t>
-        </w:r>
-      </w:hyperlink>
-      <w:r>
-        <w:t>.</w:t>
-      </w:r>
-    </w:p>
-    <w:p>
-      <w:pPr>
-        <w:rPr>
-          <w:b/>
-          <w:bCs/>
-        </w:rPr>
-      </w:pPr>
-      <w:r>
-        <w:rPr>
-          <w:b/>
-          <w:bCs/>
-        </w:rPr>
-        <w:t>Positive sides</w:t>
-      </w:r>
-    </w:p>
-    <w:p>
-      <w:pPr>
-        <w:pStyle w:val="ListBullet"/>
-      </w:pPr>
-      <w:r>
-        <w:t>Separates browser presentation from backend validation and workflow rules.</w:t>
-      </w:r>
-    </w:p>
-    <w:p>
-      <w:pPr>
-        <w:pStyle w:val="ListBullet"/>
-      </w:pPr>
-      <w:r>
-        <w:t>Reuses Django authentication and ORM integration.</w:t>
-      </w:r>
-    </w:p>
-    <w:p>
-      <w:pPr>
-        <w:rPr>
-          <w:b/>
-          <w:bCs/>
-        </w:rPr>
-      </w:pPr>
-      <w:r>
-        <w:rPr>
-          <w:b/>
-          <w:bCs/>
-        </w:rPr>
-        <w:t>Negative sides</w:t>
-      </w:r>
-    </w:p>
-    <w:p>
-      <w:pPr>
-        <w:pStyle w:val="ListBullet"/>
-      </w:pPr>
-      <w:r>
-        <w:t>Adds API concepts and serializer maintenance.</w:t>
-      </w:r>
-    </w:p>
-    <w:p>
-      <w:pPr>
-        <w:pStyle w:val="ListBullet"/>
-      </w:pPr>
-      <w:r>
-        <w:t>Default authentication does not automatically enforce organization boundaries.</w:t>
-      </w:r>
-    </w:p>
-    <w:p>
-      <w:pPr>
-        <w:rPr>
-          <w:b/>
-          <w:bCs/>
-        </w:rPr>
-      </w:pPr>
-      <w:r>
-        <w:rPr>
-          <w:b/>
-          <w:bCs/>
-        </w:rPr>
-        <w:t>Mitigation</w:t>
-      </w:r>
-    </w:p>
-    <w:p>
-      <w:pPr>
-        <w:pStyle w:val="ListBullet"/>
-      </w:pPr>
-      <w:r>
-        <w:t>Existing views check active organization membership; submission checks the requester role and related organization data.</w:t>
-      </w:r>
-    </w:p>
-    <w:p>
-      <w:pPr>
-        <w:pStyle w:val="ListBullet"/>
-      </w:pPr>
-      <w:r>
-        <w:t>API tests cover access restrictions and invalid input.</w:t>
-      </w:r>
-    </w:p>
-    <w:p>
-      <w:pPr>
-        <w:rPr>
-          <w:b/>
-          <w:bCs/>
-        </w:rPr>
-      </w:pPr>
-      <w:r>
-        <w:rPr>
-          <w:b/>
-          <w:bCs/>
-        </w:rPr>
-        <w:t>Alternatives considered</w:t>
-      </w:r>
-    </w:p>
-    <w:p>
-      <w:pPr>
-        <w:pStyle w:val="ListBullet"/>
-      </w:pPr>
-      <w:r>
-        <w:t>Plain Django JSON views reduce dependencies but require more manual request validation and response handling.</w:t>
-      </w:r>
-    </w:p>
-    <w:p>
-      <w:pPr>
-        <w:pStyle w:val="ListBullet"/>
-      </w:pPr>
-      <w:proofErr w:type="spellStart"/>
-      <w:r>
-        <w:lastRenderedPageBreak/>
-        <w:t>GraphQL</w:t>
-      </w:r>
-      <w:proofErr w:type="spellEnd"/>
-      <w:r>
-        <w:t xml:space="preserve"> supports flexible client queries but adds schema and authorization complexity for these focused endpoints.</w:t>
-      </w:r>
-    </w:p>
-    <w:p>
-      <w:pPr>
-        <w:rPr>
-          <w:b/>
-          <w:bCs/>
-        </w:rPr>
-      </w:pPr>
-      <w:r>
-        <w:rPr>
-          <w:b/>
-          <w:bCs/>
-        </w:rPr>
-        <w:t xml:space="preserve">Why </w:t>
-      </w:r>
-      <w:proofErr w:type="gramStart"/>
-      <w:r>
-        <w:rPr>
-          <w:b/>
-          <w:bCs/>
-        </w:rPr>
-        <w:t>it is</w:t>
-      </w:r>
-      <w:proofErr w:type="gramEnd"/>
-      <w:r>
-        <w:rPr>
-          <w:b/>
-          <w:bCs/>
-        </w:rPr>
-        <w:t xml:space="preserve"> the right choice for </w:t>
-      </w:r>
-      <w:proofErr w:type="spellStart"/>
-      <w:r>
-        <w:rPr>
-          <w:b/>
-          <w:bCs/>
-        </w:rPr>
-        <w:t>RightQueue</w:t>
-      </w:r>
-      <w:proofErr w:type="spellEnd"/>
-    </w:p>
-    <w:p>
-      <w:r>
-        <w:t>The frontend needs a small, explicit interface for login, services, and request creation while the backend remains responsible for permissions and data rules.</w:t>
-      </w:r>
-    </w:p>
-    <w:p>
-      <w:pPr>
-        <w:pStyle w:val="Heading1"/>
-      </w:pPr>
-      <w:bookmarkStart w:id="6" w:name="_Toc241931948"/>
-      <w:r>
-        <w:t>7. PostgreSQL for the database</w:t>
-      </w:r>
-      <w:bookmarkEnd w:id="6"/>
-    </w:p>
-    <w:p>
-      <w:pPr>
-        <w:rPr>
-          <w:b/>
-          <w:bCs/>
-        </w:rPr>
-      </w:pPr>
-      <w:r>
-        <w:rPr>
-          <w:b/>
-          <w:bCs/>
-        </w:rPr>
-        <w:t>Description</w:t>
-      </w:r>
-    </w:p>
-    <w:p>
-      <w:r>
-        <w:t xml:space="preserve">PostgreSQL is the relational database selected by the </w:t>
-      </w:r>
-      <w:hyperlink r:id="rId12">
-        <w:r>
-          <w:rPr>
-            <w:color w:val="24527A"/>
+            <w:color w:val="auto"/>
           </w:rPr>
           <w:t>CI database configuration</w:t>
         </w:r>
@@ -2994,7 +2879,7 @@
           <w:b/>
           <w:bCs/>
         </w:rPr>
-        <w:t>Positive sides</w:t>
+        <w:t>Key Strengths</w:t>
       </w:r>
     </w:p>
     <w:p>
@@ -3033,7 +2918,7 @@
           <w:b/>
           <w:bCs/>
         </w:rPr>
-        <w:t>Negative sides</w:t>
+        <w:t>Weaknesses</w:t>
       </w:r>
     </w:p>
     <w:p>
@@ -3117,15 +3002,7 @@
         <w:pStyle w:val="ListBullet"/>
       </w:pPr>
       <w:r>
-        <w:t xml:space="preserve">SQLite simplifies local setup and supports relational constraints and </w:t>
-      </w:r>
-      <w:proofErr w:type="gramStart"/>
-      <w:r>
-        <w:t>transactions, but</w:t>
-      </w:r>
-      <w:proofErr w:type="gramEnd"/>
-      <w:r>
-        <w:t xml:space="preserve"> differs from the selected server database in concurrency and operation.</w:t>
+        <w:t>SQLite simplifies local setup and supports relational constraints and transactions, but differs from the selected server database in concurrency and operation.</w:t>
       </w:r>
     </w:p>
     <w:p>
@@ -3148,70 +3025,60 @@
           <w:b/>
           <w:bCs/>
         </w:rPr>
-        <w:t xml:space="preserve">Why </w:t>
-      </w:r>
-      <w:proofErr w:type="gramStart"/>
+        <w:t xml:space="preserve">Why it is the right choice for </w:t>
+      </w:r>
+      <w:proofErr w:type="spellStart"/>
       <w:r>
         <w:rPr>
           <w:b/>
           <w:bCs/>
         </w:rPr>
-        <w:t>it is</w:t>
-      </w:r>
-      <w:proofErr w:type="gramEnd"/>
-      <w:r>
+        <w:t>RightQueue</w:t>
+      </w:r>
+      <w:proofErr w:type="spellEnd"/>
+    </w:p>
+    <w:p>
+      <w:r>
+        <w:t>Requests, organizations, memberships, and routing history require durable relationships and atomic changes. PostgreSQL supports these needs and is already exercised by the configured CI workflow</w:t>
+      </w:r>
+    </w:p>
+    <w:p>
+      <w:pPr>
+        <w:pStyle w:val="Heading1"/>
+      </w:pPr>
+      <w:bookmarkStart w:id="7" w:name="_Toc241931949"/>
+      <w:r>
+        <w:t>8. React for the frontend</w:t>
+      </w:r>
+      <w:bookmarkEnd w:id="7"/>
+    </w:p>
+    <w:p>
+      <w:pPr>
         <w:rPr>
           <w:b/>
           <w:bCs/>
         </w:rPr>
-        <w:t xml:space="preserve"> the right choice for </w:t>
-      </w:r>
-      <w:proofErr w:type="spellStart"/>
+      </w:pPr>
       <w:r>
         <w:rPr>
           <w:b/>
           <w:bCs/>
         </w:rPr>
+        <w:t>Description</w:t>
+      </w:r>
+    </w:p>
+    <w:p>
+      <w:r>
+        <w:t xml:space="preserve">React is a user interface library. </w:t>
+      </w:r>
+      <w:proofErr w:type="spellStart"/>
+      <w:r>
         <w:t>RightQueue</w:t>
       </w:r>
       <w:proofErr w:type="spellEnd"/>
-    </w:p>
-    <w:p>
-      <w:r>
-        <w:t xml:space="preserve">Requests, organizations, memberships, and routing history require durable relationships and atomic changes. PostgreSQL supports these needs and is already exercised by the configured CI workflow. See </w:t>
-      </w:r>
-      <w:hyperlink r:id="rId13">
-        <w:r>
-          <w:rPr>
-            <w:color w:val="24527A"/>
-          </w:rPr>
-          <w:t>model constraints</w:t>
-        </w:r>
-      </w:hyperlink>
-      <w:r>
-        <w:t xml:space="preserve"> and </w:t>
-      </w:r>
-      <w:hyperlink r:id="rId14">
-        <w:r>
-          <w:rPr>
-            <w:color w:val="24527A"/>
-          </w:rPr>
-          <w:t>transactional submission</w:t>
-        </w:r>
-      </w:hyperlink>
-      <w:r>
-        <w:t>.</w:t>
-      </w:r>
-    </w:p>
-    <w:p>
-      <w:pPr>
-        <w:pStyle w:val="Heading1"/>
-      </w:pPr>
-      <w:bookmarkStart w:id="7" w:name="_Toc241931949"/>
-      <w:r>
-        <w:t>8. React for the frontend</w:t>
-      </w:r>
-      <w:bookmarkEnd w:id="7"/>
+      <w:r>
+        <w:t xml:space="preserve"> uses components, hooks, and an authentication context to build browser pages and share sign-in state. </w:t>
+      </w:r>
     </w:p>
     <w:p>
       <w:pPr>
@@ -3225,55 +3092,23 @@
           <w:b/>
           <w:bCs/>
         </w:rPr>
-        <w:t>Description</w:t>
-      </w:r>
-    </w:p>
-    <w:p>
-      <w:r>
-        <w:t xml:space="preserve">React is a user interface library. </w:t>
-      </w:r>
-      <w:proofErr w:type="spellStart"/>
-      <w:r>
-        <w:t>RightQueue</w:t>
-      </w:r>
-      <w:proofErr w:type="spellEnd"/>
-      <w:r>
-        <w:t xml:space="preserve"> uses components, hooks, and an authentication context to build browser pages and share sign-in state. See </w:t>
-      </w:r>
-      <w:hyperlink r:id="rId15">
-        <w:r>
-          <w:rPr>
-            <w:color w:val="24527A"/>
-          </w:rPr>
-          <w:t>feature folders</w:t>
-        </w:r>
-      </w:hyperlink>
-      <w:r>
-        <w:t xml:space="preserve">, </w:t>
-      </w:r>
-      <w:hyperlink r:id="rId16">
-        <w:proofErr w:type="spellStart"/>
-        <w:r>
-          <w:rPr>
-            <w:color w:val="24527A"/>
-          </w:rPr>
-          <w:t>AuthProvider</w:t>
-        </w:r>
-        <w:proofErr w:type="spellEnd"/>
-      </w:hyperlink>
-      <w:r>
-        <w:t xml:space="preserve">, and </w:t>
-      </w:r>
-      <w:hyperlink r:id="rId17">
-        <w:r>
-          <w:rPr>
-            <w:color w:val="24527A"/>
-          </w:rPr>
-          <w:t>shared components</w:t>
-        </w:r>
-      </w:hyperlink>
-      <w:r>
-        <w:t>.</w:t>
+        <w:t>Key Strengths</w:t>
+      </w:r>
+    </w:p>
+    <w:p>
+      <w:pPr>
+        <w:pStyle w:val="ListBullet"/>
+      </w:pPr>
+      <w:r>
+        <w:t>Reusable layouts and components support consistent pages.</w:t>
+      </w:r>
+    </w:p>
+    <w:p>
+      <w:pPr>
+        <w:pStyle w:val="ListBullet"/>
+      </w:pPr>
+      <w:r>
+        <w:t>Shared authentication state supports protected routes and session restoration.</w:t>
       </w:r>
     </w:p>
     <w:p>
@@ -3288,7 +3123,7 @@
           <w:b/>
           <w:bCs/>
         </w:rPr>
-        <w:t>Positive sides</w:t>
+        <w:t>Weaknesses</w:t>
       </w:r>
     </w:p>
     <w:p>
@@ -3296,7 +3131,7 @@
         <w:pStyle w:val="ListBullet"/>
       </w:pPr>
       <w:r>
-        <w:t>Reusable layouts and components support consistent pages.</w:t>
+        <w:t>A separate frontend introduces state, loading, and API error handling.</w:t>
       </w:r>
     </w:p>
     <w:p>
@@ -3304,7 +3139,7 @@
         <w:pStyle w:val="ListBullet"/>
       </w:pPr>
       <w:r>
-        <w:t>Shared authentication state supports protected routes and session restoration.</w:t>
+        <w:t>Client and server behavior must remain aligned.</w:t>
       </w:r>
     </w:p>
     <w:p>
@@ -3319,7 +3154,7 @@
           <w:b/>
           <w:bCs/>
         </w:rPr>
-        <w:t>Negative sides</w:t>
+        <w:t>Mitigation</w:t>
       </w:r>
     </w:p>
     <w:p>
@@ -3327,7 +3162,7 @@
         <w:pStyle w:val="ListBullet"/>
       </w:pPr>
       <w:r>
-        <w:t>A separate frontend introduces state, loading, and API error handling.</w:t>
+        <w:t>Existing feature-based folders, focused components, and a shared API client separate responsibilities.</w:t>
       </w:r>
     </w:p>
     <w:p>
@@ -3335,7 +3170,8 @@
         <w:pStyle w:val="ListBullet"/>
       </w:pPr>
       <w:r>
-        <w:t>Client and server behavior must remain aligned.</w:t>
+        <w:lastRenderedPageBreak/>
+        <w:t>The backend checks permissions independently of frontend state.</w:t>
       </w:r>
     </w:p>
     <w:p>
@@ -3350,7 +3186,7 @@
           <w:b/>
           <w:bCs/>
         </w:rPr>
-        <w:t>Mitigation</w:t>
+        <w:t>Alternatives considered</w:t>
       </w:r>
     </w:p>
     <w:p>
@@ -3358,16 +3194,7 @@
         <w:pStyle w:val="ListBullet"/>
       </w:pPr>
       <w:r>
-        <w:lastRenderedPageBreak/>
-        <w:t xml:space="preserve">Existing feature-based folders, focused components, and a </w:t>
-      </w:r>
-      <w:proofErr w:type="gramStart"/>
-      <w:r>
-        <w:t>shared API client separate responsibilities</w:t>
-      </w:r>
-      <w:proofErr w:type="gramEnd"/>
-      <w:r>
-        <w:t>.</w:t>
+        <w:t>Django templates reduce separate frontend infrastructure but provide a different model for interactive browser state.</w:t>
       </w:r>
     </w:p>
     <w:p>
@@ -3375,7 +3202,7 @@
         <w:pStyle w:val="ListBullet"/>
       </w:pPr>
       <w:r>
-        <w:t>The backend checks permissions independently of frontend state.</w:t>
+        <w:t>Vue also supports reusable components, with different template and state conventions.</w:t>
       </w:r>
     </w:p>
     <w:p>
@@ -3390,79 +3217,91 @@
           <w:b/>
           <w:bCs/>
         </w:rPr>
-        <w:t>Alternatives considered</w:t>
-      </w:r>
-    </w:p>
-    <w:p>
-      <w:pPr>
-        <w:pStyle w:val="ListBullet"/>
-      </w:pPr>
-      <w:r>
-        <w:t>Django templates reduce separate frontend infrastructure but provide a different model for interactive browser state.</w:t>
-      </w:r>
-    </w:p>
-    <w:p>
-      <w:pPr>
-        <w:pStyle w:val="ListBullet"/>
-      </w:pPr>
-      <w:r>
-        <w:t>Vue also supports reusable components, with different template and state conventions.</w:t>
-      </w:r>
-    </w:p>
-    <w:p>
-      <w:pPr>
+        <w:t xml:space="preserve">Why it is the right choice for </w:t>
+      </w:r>
+      <w:proofErr w:type="spellStart"/>
+      <w:r>
         <w:rPr>
           <w:b/>
           <w:bCs/>
         </w:rPr>
-      </w:pPr>
-      <w:r>
+        <w:t>RightQueue</w:t>
+      </w:r>
+      <w:proofErr w:type="spellEnd"/>
+    </w:p>
+    <w:p>
+      <w:r>
+        <w:t>React provides a reusable foundation for the existing sign-in and requester pages and future staff interfaces while keeping presentation separate from workflow rules.</w:t>
+      </w:r>
+    </w:p>
+    <w:p>
+      <w:pPr>
+        <w:pStyle w:val="Heading1"/>
+      </w:pPr>
+      <w:bookmarkStart w:id="8" w:name="_Toc241931950"/>
+      <w:r>
+        <w:t>9. TypeScript for frontend type safety</w:t>
+      </w:r>
+      <w:bookmarkEnd w:id="8"/>
+    </w:p>
+    <w:p>
+      <w:pPr>
         <w:rPr>
           <w:b/>
           <w:bCs/>
         </w:rPr>
-        <w:t xml:space="preserve">Why </w:t>
-      </w:r>
-      <w:proofErr w:type="gramStart"/>
+      </w:pPr>
       <w:r>
         <w:rPr>
           <w:b/>
           <w:bCs/>
         </w:rPr>
-        <w:t>it is</w:t>
-      </w:r>
-      <w:proofErr w:type="gramEnd"/>
-      <w:r>
+        <w:t>Description</w:t>
+      </w:r>
+    </w:p>
+    <w:p>
+      <w:r>
+        <w:t xml:space="preserve">TypeScript extends JavaScript with static types. </w:t>
+      </w:r>
+      <w:proofErr w:type="spellStart"/>
+      <w:r>
+        <w:t>RightQueue</w:t>
+      </w:r>
+      <w:proofErr w:type="spellEnd"/>
+      <w:r>
+        <w:t xml:space="preserve"> defines authentication and requester types and uses generic API helpers; the build runs the TypeScript compiler. </w:t>
+      </w:r>
+    </w:p>
+    <w:p>
+      <w:pPr>
         <w:rPr>
           <w:b/>
           <w:bCs/>
         </w:rPr>
-        <w:t xml:space="preserve"> the right choice for </w:t>
-      </w:r>
-      <w:proofErr w:type="spellStart"/>
+      </w:pPr>
       <w:r>
         <w:rPr>
           <w:b/>
           <w:bCs/>
         </w:rPr>
-        <w:t>RightQueue</w:t>
-      </w:r>
-      <w:proofErr w:type="spellEnd"/>
-    </w:p>
-    <w:p>
-      <w:r>
-        <w:t>React provides a reusable foundation for the existing sign-in and requester pages and future staff interfaces while keeping presentation separate from workflow rules.</w:t>
-      </w:r>
-    </w:p>
-    <w:p>
-      <w:pPr>
-        <w:pStyle w:val="Heading1"/>
-      </w:pPr>
-      <w:bookmarkStart w:id="8" w:name="_Toc241931950"/>
-      <w:r>
-        <w:t>9. TypeScript for frontend type safety</w:t>
-      </w:r>
-      <w:bookmarkEnd w:id="8"/>
+        <w:t>Key Strengths</w:t>
+      </w:r>
+    </w:p>
+    <w:p>
+      <w:pPr>
+        <w:pStyle w:val="ListBullet"/>
+      </w:pPr>
+      <w:r>
+        <w:t>Compile-time checking catches incompatible uses of declared API data and component properties.</w:t>
+      </w:r>
+    </w:p>
+    <w:p>
+      <w:pPr>
+        <w:pStyle w:val="ListBullet"/>
+      </w:pPr>
+      <w:r>
+        <w:t>Named types make expected payloads easier to understand and change.</w:t>
+      </w:r>
     </w:p>
     <w:p>
       <w:pPr>
@@ -3476,53 +3315,23 @@
           <w:b/>
           <w:bCs/>
         </w:rPr>
-        <w:t>Description</w:t>
-      </w:r>
-    </w:p>
-    <w:p>
-      <w:r>
-        <w:t xml:space="preserve">TypeScript extends JavaScript with static types. </w:t>
-      </w:r>
-      <w:proofErr w:type="spellStart"/>
-      <w:r>
-        <w:t>RightQueue</w:t>
-      </w:r>
-      <w:proofErr w:type="spellEnd"/>
-      <w:r>
-        <w:t xml:space="preserve"> defines authentication and requester types and uses generic API helpers; the build runs the TypeScript compiler. See </w:t>
-      </w:r>
-      <w:hyperlink r:id="rId18">
-        <w:r>
-          <w:rPr>
-            <w:color w:val="24527A"/>
-          </w:rPr>
-          <w:t>requester types</w:t>
-        </w:r>
-      </w:hyperlink>
-      <w:r>
-        <w:t xml:space="preserve">, </w:t>
-      </w:r>
-      <w:hyperlink r:id="rId19">
-        <w:r>
-          <w:rPr>
-            <w:color w:val="24527A"/>
-          </w:rPr>
-          <w:t>API client</w:t>
-        </w:r>
-      </w:hyperlink>
-      <w:r>
-        <w:t xml:space="preserve">, and </w:t>
-      </w:r>
-      <w:hyperlink r:id="rId20">
-        <w:r>
-          <w:rPr>
-            <w:color w:val="24527A"/>
-          </w:rPr>
-          <w:t>build scripts</w:t>
-        </w:r>
-      </w:hyperlink>
-      <w:r>
-        <w:t>.</w:t>
+        <w:t>Weaknesses</w:t>
+      </w:r>
+    </w:p>
+    <w:p>
+      <w:pPr>
+        <w:pStyle w:val="ListBullet"/>
+      </w:pPr>
+      <w:r>
+        <w:t>Adds type definitions and compiler configuration to frontend development.</w:t>
+      </w:r>
+    </w:p>
+    <w:p>
+      <w:pPr>
+        <w:pStyle w:val="ListBullet"/>
+      </w:pPr>
+      <w:r>
+        <w:t>Type assertions on JSON responses do not validate actual server data at runtime.</w:t>
       </w:r>
     </w:p>
     <w:p>
@@ -3537,7 +3346,7 @@
           <w:b/>
           <w:bCs/>
         </w:rPr>
-        <w:t>Positive sides</w:t>
+        <w:t>Mitigation</w:t>
       </w:r>
     </w:p>
     <w:p>
@@ -3545,7 +3354,7 @@
         <w:pStyle w:val="ListBullet"/>
       </w:pPr>
       <w:r>
-        <w:t>Compile-time checking catches incompatible uses of declared API data and component properties.</w:t>
+        <w:t>Share API utilities and keep types beside their features.</w:t>
       </w:r>
     </w:p>
     <w:p>
@@ -3553,7 +3362,13 @@
         <w:pStyle w:val="ListBullet"/>
       </w:pPr>
       <w:r>
-        <w:t>Named types make expected payloads easier to understand and change.</w:t>
+        <w:rPr>
+          <w:b/>
+        </w:rPr>
+        <w:t>Planned:</w:t>
+      </w:r>
+      <w:r>
+        <w:t xml:space="preserve"> strengthen compiler checks and introduce runtime response validation where needed; the current app configuration does not enable strict mode.</w:t>
       </w:r>
     </w:p>
     <w:p>
@@ -3568,7 +3383,7 @@
           <w:b/>
           <w:bCs/>
         </w:rPr>
-        <w:t>Negative sides</w:t>
+        <w:t>Alternatives considered</w:t>
       </w:r>
     </w:p>
     <w:p>
@@ -3576,7 +3391,7 @@
         <w:pStyle w:val="ListBullet"/>
       </w:pPr>
       <w:r>
-        <w:t>Adds type definitions and compiler configuration to frontend development.</w:t>
+        <w:t>JavaScript removes the compilation type layer but provides fewer checks before execution.</w:t>
       </w:r>
     </w:p>
     <w:p>
@@ -3584,7 +3399,15 @@
         <w:pStyle w:val="ListBullet"/>
       </w:pPr>
       <w:r>
-        <w:t>Type assertions on JSON responses do not validate actual server data at runtime.</w:t>
+        <w:t xml:space="preserve">JavaScript with </w:t>
+      </w:r>
+      <w:proofErr w:type="spellStart"/>
+      <w:r>
+        <w:t>JSDoc</w:t>
+      </w:r>
+      <w:proofErr w:type="spellEnd"/>
+      <w:r>
+        <w:t xml:space="preserve"> can add type information while retaining JavaScript source, with different annotation conventions.</w:t>
       </w:r>
     </w:p>
     <w:p>
@@ -3599,153 +3422,61 @@
           <w:b/>
           <w:bCs/>
         </w:rPr>
-        <w:t>Mitigation</w:t>
-      </w:r>
-    </w:p>
-    <w:p>
-      <w:pPr>
-        <w:pStyle w:val="ListBullet"/>
-      </w:pPr>
-      <w:r>
-        <w:t>Share API utilities and keep types beside their features.</w:t>
-      </w:r>
-    </w:p>
-    <w:p>
-      <w:pPr>
-        <w:pStyle w:val="ListBullet"/>
-      </w:pPr>
-      <w:r>
-        <w:rPr>
-          <w:b/>
-        </w:rPr>
-        <w:t>Planned:</w:t>
-      </w:r>
-      <w:r>
-        <w:t xml:space="preserve"> strengthen compiler checks and introduce runtime response validation where needed; the current app configuration does not enable strict mode.</w:t>
-      </w:r>
-    </w:p>
-    <w:p>
-      <w:pPr>
+        <w:t xml:space="preserve">Why it is the right choice for </w:t>
+      </w:r>
+      <w:proofErr w:type="spellStart"/>
+      <w:r>
         <w:rPr>
           <w:b/>
           <w:bCs/>
         </w:rPr>
-      </w:pPr>
-      <w:r>
+        <w:t>RightQueue</w:t>
+      </w:r>
+      <w:proofErr w:type="spellEnd"/>
+    </w:p>
+    <w:p>
+      <w:r>
+        <w:t>Explicit membership, service, and request types help maintain the frontend as API workflows grow, without changing its React component model.</w:t>
+      </w:r>
+    </w:p>
+    <w:p>
+      <w:pPr>
+        <w:pStyle w:val="Heading1"/>
+      </w:pPr>
+      <w:bookmarkStart w:id="9" w:name="_Toc241931951"/>
+      <w:r>
+        <w:t>10. Vite for frontend development and builds</w:t>
+      </w:r>
+      <w:bookmarkEnd w:id="9"/>
+    </w:p>
+    <w:p>
+      <w:pPr>
         <w:rPr>
           <w:b/>
           <w:bCs/>
         </w:rPr>
-        <w:t>Alternatives considered</w:t>
-      </w:r>
-    </w:p>
-    <w:p>
-      <w:pPr>
-        <w:pStyle w:val="ListBullet"/>
-      </w:pPr>
-      <w:r>
-        <w:t>JavaScript removes the compilation type layer but provides fewer checks before execution.</w:t>
-      </w:r>
-    </w:p>
-    <w:p>
-      <w:pPr>
-        <w:pStyle w:val="ListBullet"/>
-      </w:pPr>
-      <w:r>
-        <w:t xml:space="preserve">JavaScript with </w:t>
-      </w:r>
-      <w:proofErr w:type="spellStart"/>
-      <w:r>
-        <w:t>JSDoc</w:t>
-      </w:r>
-      <w:proofErr w:type="spellEnd"/>
-      <w:r>
-        <w:t xml:space="preserve"> can add type information while retaining JavaScript source, with different annotation conventions.</w:t>
-      </w:r>
-    </w:p>
-    <w:p>
-      <w:pPr>
+      </w:pPr>
+      <w:r>
         <w:rPr>
           <w:b/>
           <w:bCs/>
         </w:rPr>
-      </w:pPr>
-      <w:r>
-        <w:rPr>
-          <w:b/>
-          <w:bCs/>
-        </w:rPr>
-        <w:t xml:space="preserve">Why </w:t>
-      </w:r>
-      <w:proofErr w:type="gramStart"/>
-      <w:r>
-        <w:rPr>
-          <w:b/>
-          <w:bCs/>
-        </w:rPr>
-        <w:t>it is</w:t>
-      </w:r>
-      <w:proofErr w:type="gramEnd"/>
-      <w:r>
-        <w:rPr>
-          <w:b/>
-          <w:bCs/>
-        </w:rPr>
-        <w:t xml:space="preserve"> the right choice for </w:t>
+        <w:t>Description</w:t>
+      </w:r>
+    </w:p>
+    <w:p>
+      <w:r>
+        <w:t xml:space="preserve">Vite is a frontend development server and build tool. </w:t>
       </w:r>
       <w:proofErr w:type="spellStart"/>
       <w:r>
-        <w:rPr>
-          <w:b/>
-          <w:bCs/>
-        </w:rPr>
         <w:t>RightQueue</w:t>
       </w:r>
       <w:proofErr w:type="spellEnd"/>
-    </w:p>
-    <w:p>
-      <w:r>
-        <w:t>Explicit membership, service, and request types help maintain the frontend as API workflows grow, without changing its React component model.</w:t>
-      </w:r>
-    </w:p>
-    <w:p>
-      <w:pPr>
-        <w:pStyle w:val="Heading1"/>
-      </w:pPr>
-      <w:bookmarkStart w:id="9" w:name="_Toc241931951"/>
-      <w:r>
-        <w:t>10. Vite for frontend development and builds</w:t>
-      </w:r>
-      <w:bookmarkEnd w:id="9"/>
-    </w:p>
-    <w:p>
-      <w:pPr>
-        <w:rPr>
-          <w:b/>
-          <w:bCs/>
-        </w:rPr>
-      </w:pPr>
-      <w:r>
-        <w:rPr>
-          <w:b/>
-          <w:bCs/>
-        </w:rPr>
-        <w:t>Description</w:t>
-      </w:r>
-    </w:p>
-    <w:p>
-      <w:r>
-        <w:t xml:space="preserve">Vite is a frontend development server and build tool. </w:t>
-      </w:r>
-      <w:proofErr w:type="spellStart"/>
-      <w:r>
-        <w:t>RightQueue</w:t>
-      </w:r>
-      <w:proofErr w:type="spellEnd"/>
       <w:r>
         <w:t xml:space="preserve"> configures React and Tailwind plugins and provides development, build, and preview scripts. See </w:t>
       </w:r>
-      <w:hyperlink r:id="rId21">
+      <w:hyperlink r:id="rId10">
         <w:r>
           <w:rPr>
             <w:color w:val="24527A"/>
@@ -3756,7 +3487,7 @@
       <w:r>
         <w:t xml:space="preserve"> and </w:t>
       </w:r>
-      <w:hyperlink r:id="rId22">
+      <w:hyperlink r:id="rId11">
         <w:r>
           <w:rPr>
             <w:color w:val="24527A"/>
@@ -3780,7 +3511,7 @@
           <w:b/>
           <w:bCs/>
         </w:rPr>
-        <w:t>Positive sides</w:t>
+        <w:t>Key Strengths</w:t>
       </w:r>
     </w:p>
     <w:p>
@@ -3811,7 +3542,7 @@
           <w:b/>
           <w:bCs/>
         </w:rPr>
-        <w:t>Negative sides</w:t>
+        <w:t>Weaknesses</w:t>
       </w:r>
     </w:p>
     <w:p>
@@ -3896,15 +3627,7 @@
         <w:pStyle w:val="ListBullet"/>
       </w:pPr>
       <w:r>
-        <w:t xml:space="preserve">A </w:t>
-      </w:r>
-      <w:proofErr w:type="gramStart"/>
-      <w:r>
-        <w:t>custom</w:t>
-      </w:r>
-      <w:proofErr w:type="gramEnd"/>
-      <w:r>
-        <w:t xml:space="preserve"> webpack setup offers detailed control but requires more configuration.</w:t>
+        <w:t>A custom webpack setup offers detailed control but requires more configuration.</w:t>
       </w:r>
     </w:p>
     <w:p>
@@ -3927,77 +3650,61 @@
           <w:b/>
           <w:bCs/>
         </w:rPr>
-        <w:t xml:space="preserve">Why </w:t>
-      </w:r>
-      <w:proofErr w:type="gramStart"/>
+        <w:t xml:space="preserve">Why it is the right choice for </w:t>
+      </w:r>
+      <w:proofErr w:type="spellStart"/>
       <w:r>
         <w:rPr>
           <w:b/>
           <w:bCs/>
         </w:rPr>
-        <w:t>it is</w:t>
-      </w:r>
-      <w:proofErr w:type="gramEnd"/>
-      <w:r>
+        <w:t>RightQueue</w:t>
+      </w:r>
+      <w:proofErr w:type="spellEnd"/>
+    </w:p>
+    <w:p>
+      <w:r>
+        <w:t>Vite supports the existing React application with limited build configuration while Django owns the backend.</w:t>
+      </w:r>
+    </w:p>
+    <w:p>
+      <w:pPr>
+        <w:pStyle w:val="Heading1"/>
+      </w:pPr>
+      <w:bookmarkStart w:id="10" w:name="_Toc241931952"/>
+      <w:r>
+        <w:t>11. Tailwind CSS for styling</w:t>
+      </w:r>
+      <w:bookmarkEnd w:id="10"/>
+    </w:p>
+    <w:p>
+      <w:pPr>
         <w:rPr>
           <w:b/>
           <w:bCs/>
         </w:rPr>
-        <w:t xml:space="preserve"> the right choice for </w:t>
-      </w:r>
-      <w:proofErr w:type="spellStart"/>
+      </w:pPr>
       <w:r>
         <w:rPr>
           <w:b/>
           <w:bCs/>
         </w:rPr>
+        <w:t>Description</w:t>
+      </w:r>
+    </w:p>
+    <w:p>
+      <w:r>
+        <w:t xml:space="preserve">Tailwind CSS is a utility-first CSS framework. </w:t>
+      </w:r>
+      <w:proofErr w:type="spellStart"/>
+      <w:r>
         <w:t>RightQueue</w:t>
       </w:r>
       <w:proofErr w:type="spellEnd"/>
-    </w:p>
-    <w:p>
-      <w:r>
-        <w:t>Vite supports the existing React application with limited build configuration while Django owns the backend.</w:t>
-      </w:r>
-    </w:p>
-    <w:p>
-      <w:pPr>
-        <w:pStyle w:val="Heading1"/>
-      </w:pPr>
-      <w:bookmarkStart w:id="10" w:name="_Toc241931952"/>
-      <w:r>
-        <w:t>11. Tailwind CSS for styling</w:t>
-      </w:r>
-      <w:bookmarkEnd w:id="10"/>
-    </w:p>
-    <w:p>
-      <w:pPr>
-        <w:rPr>
-          <w:b/>
-          <w:bCs/>
-        </w:rPr>
-      </w:pPr>
-      <w:r>
-        <w:rPr>
-          <w:b/>
-          <w:bCs/>
-        </w:rPr>
-        <w:t>Description</w:t>
-      </w:r>
-    </w:p>
-    <w:p>
-      <w:r>
-        <w:t xml:space="preserve">Tailwind CSS is a utility-first CSS framework. </w:t>
-      </w:r>
-      <w:proofErr w:type="spellStart"/>
-      <w:r>
-        <w:t>RightQueue</w:t>
-      </w:r>
-      <w:proofErr w:type="spellEnd"/>
       <w:r>
         <w:t xml:space="preserve"> imports it in </w:t>
       </w:r>
-      <w:hyperlink r:id="rId23">
+      <w:hyperlink r:id="rId12">
         <w:r>
           <w:rPr>
             <w:color w:val="24527A"/>
@@ -4021,7 +3728,7 @@
           <w:b/>
           <w:bCs/>
         </w:rPr>
-        <w:t>Positive sides</w:t>
+        <w:t>Key Strengths</w:t>
       </w:r>
     </w:p>
     <w:p>
@@ -4052,7 +3759,7 @@
           <w:b/>
           <w:bCs/>
         </w:rPr>
-        <w:t>Negative sides</w:t>
+        <w:t>Weaknesses</w:t>
       </w:r>
     </w:p>
     <w:p>
@@ -4151,48 +3858,60 @@
           <w:b/>
           <w:bCs/>
         </w:rPr>
-        <w:t xml:space="preserve">Why </w:t>
-      </w:r>
-      <w:proofErr w:type="gramStart"/>
+        <w:t xml:space="preserve">Why it is the right choice for </w:t>
+      </w:r>
+      <w:proofErr w:type="spellStart"/>
       <w:r>
         <w:rPr>
           <w:b/>
           <w:bCs/>
         </w:rPr>
-        <w:t>it is</w:t>
-      </w:r>
-      <w:proofErr w:type="gramEnd"/>
-      <w:r>
+        <w:t>RightQueue</w:t>
+      </w:r>
+      <w:proofErr w:type="spellEnd"/>
+    </w:p>
+    <w:p>
+      <w:r>
+        <w:t>Tailwind supports quick development of the existing portal and request form while allowing a consistent visual style through reusable components.</w:t>
+      </w:r>
+    </w:p>
+    <w:p>
+      <w:pPr>
+        <w:pStyle w:val="Heading1"/>
+      </w:pPr>
+      <w:bookmarkStart w:id="11" w:name="_Toc241931953"/>
+      <w:r>
+        <w:t>12. React Router for client-side routing</w:t>
+      </w:r>
+      <w:bookmarkEnd w:id="11"/>
+    </w:p>
+    <w:p>
+      <w:pPr>
         <w:rPr>
           <w:b/>
           <w:bCs/>
         </w:rPr>
-        <w:t xml:space="preserve"> the right choice for </w:t>
-      </w:r>
-      <w:proofErr w:type="spellStart"/>
+      </w:pPr>
       <w:r>
         <w:rPr>
           <w:b/>
           <w:bCs/>
         </w:rPr>
+        <w:t>Description</w:t>
+      </w:r>
+    </w:p>
+    <w:p>
+      <w:r>
+        <w:t xml:space="preserve">React Router is a routing library. </w:t>
+      </w:r>
+      <w:proofErr w:type="spellStart"/>
+      <w:r>
         <w:t>RightQueue</w:t>
       </w:r>
       <w:proofErr w:type="spellEnd"/>
-    </w:p>
-    <w:p>
-      <w:r>
-        <w:t>Tailwind supports quick development of the existing portal and request form while allowing a consistent visual style through reusable components.</w:t>
-      </w:r>
-    </w:p>
-    <w:p>
-      <w:pPr>
-        <w:pStyle w:val="Heading1"/>
-      </w:pPr>
-      <w:bookmarkStart w:id="11" w:name="_Toc241931953"/>
-      <w:r>
-        <w:t>12. React Router for client-side routing</w:t>
-      </w:r>
-      <w:bookmarkEnd w:id="11"/>
+      <w:r>
+        <w:t xml:space="preserve"> maps browser paths to public and authenticated pages and uses organization slugs in request URLs. </w:t>
+      </w:r>
     </w:p>
     <w:p>
       <w:pPr>
@@ -4206,44 +3925,23 @@
           <w:b/>
           <w:bCs/>
         </w:rPr>
-        <w:t>Description</w:t>
-      </w:r>
-    </w:p>
-    <w:p>
-      <w:r>
-        <w:t xml:space="preserve">React Router is a routing library. </w:t>
-      </w:r>
-      <w:proofErr w:type="spellStart"/>
-      <w:r>
-        <w:t>RightQueue</w:t>
-      </w:r>
-      <w:proofErr w:type="spellEnd"/>
-      <w:r>
-        <w:t xml:space="preserve"> maps browser paths to public and authenticated pages and uses organization slugs in request URLs. See </w:t>
-      </w:r>
-      <w:hyperlink r:id="rId24">
-        <w:r>
-          <w:rPr>
-            <w:color w:val="24527A"/>
-          </w:rPr>
-          <w:t>routes</w:t>
-        </w:r>
-      </w:hyperlink>
-      <w:r>
-        <w:t xml:space="preserve"> and </w:t>
-      </w:r>
-      <w:hyperlink r:id="rId25">
-        <w:proofErr w:type="spellStart"/>
-        <w:r>
-          <w:rPr>
-            <w:color w:val="24527A"/>
-          </w:rPr>
-          <w:t>ProtectedRoute</w:t>
-        </w:r>
-        <w:proofErr w:type="spellEnd"/>
-      </w:hyperlink>
-      <w:r>
-        <w:t>.</w:t>
+        <w:t>Key Strengths</w:t>
+      </w:r>
+    </w:p>
+    <w:p>
+      <w:pPr>
+        <w:pStyle w:val="ListBullet"/>
+      </w:pPr>
+      <w:r>
+        <w:t>Gives sign-in, dashboard, and request pages explicit URLs.</w:t>
+      </w:r>
+    </w:p>
+    <w:p>
+      <w:pPr>
+        <w:pStyle w:val="ListBullet"/>
+      </w:pPr>
+      <w:r>
+        <w:t>Reuses one authentication guard with a session loading state.</w:t>
       </w:r>
     </w:p>
     <w:p>
@@ -4258,7 +3956,7 @@
           <w:b/>
           <w:bCs/>
         </w:rPr>
-        <w:t>Positive sides</w:t>
+        <w:t>Weaknesses</w:t>
       </w:r>
     </w:p>
     <w:p>
@@ -4266,7 +3964,7 @@
         <w:pStyle w:val="ListBullet"/>
       </w:pPr>
       <w:r>
-        <w:t>Gives sign-in, dashboard, and request pages explicit URLs.</w:t>
+        <w:t>Frontend guards do not secure backend resources.</w:t>
       </w:r>
     </w:p>
     <w:p>
@@ -4274,7 +3972,7 @@
         <w:pStyle w:val="ListBullet"/>
       </w:pPr>
       <w:r>
-        <w:t>Reuses one authentication guard with a session loading state.</w:t>
+        <w:t>Direct navigation to nested paths requires suitable hosting fallback behavior.</w:t>
       </w:r>
     </w:p>
     <w:p>
@@ -4289,7 +3987,7 @@
           <w:b/>
           <w:bCs/>
         </w:rPr>
-        <w:t>Negative sides</w:t>
+        <w:t>Mitigation</w:t>
       </w:r>
     </w:p>
     <w:p>
@@ -4297,7 +3995,7 @@
         <w:pStyle w:val="ListBullet"/>
       </w:pPr>
       <w:r>
-        <w:t>Frontend guards do not secure backend resources.</w:t>
+        <w:t>Backend endpoints enforce authentication and organization membership.</w:t>
       </w:r>
     </w:p>
     <w:p>
@@ -4305,7 +4003,13 @@
         <w:pStyle w:val="ListBullet"/>
       </w:pPr>
       <w:r>
-        <w:t>Direct navigation to nested paths requires suitable hosting fallback behavior.</w:t>
+        <w:rPr>
+          <w:b/>
+        </w:rPr>
+        <w:t>Planned:</w:t>
+      </w:r>
+      <w:r>
+        <w:t xml:space="preserve"> configure the host to serve the application for browser routes and test direct links.</w:t>
       </w:r>
     </w:p>
     <w:p>
@@ -4320,7 +4024,7 @@
           <w:b/>
           <w:bCs/>
         </w:rPr>
-        <w:t>Mitigation</w:t>
+        <w:t>Alternatives considered</w:t>
       </w:r>
     </w:p>
     <w:p>
@@ -4328,21 +4032,20 @@
         <w:pStyle w:val="ListBullet"/>
       </w:pPr>
       <w:r>
-        <w:t>Backend endpoints enforce authentication and organization membership.</w:t>
+        <w:t>Server-rendered Django routes simplify browser navigation but move page rendering to the backend.</w:t>
       </w:r>
     </w:p>
     <w:p>
       <w:pPr>
         <w:pStyle w:val="ListBullet"/>
       </w:pPr>
-      <w:r>
-        <w:rPr>
-          <w:b/>
-        </w:rPr>
-        <w:t>Planned:</w:t>
-      </w:r>
-      <w:r>
-        <w:t xml:space="preserve"> configure the host to serve the application for browser routes and test direct links.</w:t>
+      <w:proofErr w:type="spellStart"/>
+      <w:r>
+        <w:t>TanStack</w:t>
+      </w:r>
+      <w:proofErr w:type="spellEnd"/>
+      <w:r>
+        <w:t xml:space="preserve"> Router offers a different, strongly typed routing model with additional conventions to learn.</w:t>
       </w:r>
     </w:p>
     <w:p>
@@ -4357,85 +4060,92 @@
           <w:b/>
           <w:bCs/>
         </w:rPr>
-        <w:t>Alternatives considered</w:t>
-      </w:r>
-    </w:p>
-    <w:p>
-      <w:pPr>
-        <w:pStyle w:val="ListBullet"/>
-      </w:pPr>
-      <w:r>
-        <w:t>Server-rendered Django routes simplify browser navigation but move page rendering to the backend.</w:t>
-      </w:r>
-    </w:p>
-    <w:p>
-      <w:pPr>
-        <w:pStyle w:val="ListBullet"/>
-      </w:pPr>
+        <w:t xml:space="preserve">Why it is the right choice for </w:t>
+      </w:r>
       <w:proofErr w:type="spellStart"/>
       <w:r>
-        <w:t>TanStack</w:t>
-      </w:r>
-      <w:proofErr w:type="spellEnd"/>
-      <w:r>
-        <w:t xml:space="preserve"> Router offers a different, strongly typed routing model with additional conventions to learn.</w:t>
-      </w:r>
-    </w:p>
-    <w:p>
-      <w:pPr>
         <w:rPr>
           <w:b/>
           <w:bCs/>
         </w:rPr>
-      </w:pPr>
-      <w:r>
+        <w:t>RightQueue</w:t>
+      </w:r>
+      <w:proofErr w:type="spellEnd"/>
+    </w:p>
+    <w:p>
+      <w:r>
+        <w:lastRenderedPageBreak/>
+        <w:t>The existing route structure keeps public pages and authenticated requester pages understandable and can expand to staff pages later.</w:t>
+      </w:r>
+    </w:p>
+    <w:p>
+      <w:pPr>
+        <w:pStyle w:val="Heading1"/>
+      </w:pPr>
+      <w:bookmarkStart w:id="12" w:name="_Toc241931954"/>
+      <w:r>
+        <w:t>13. Django session authentication with CSRF protection</w:t>
+      </w:r>
+      <w:bookmarkEnd w:id="12"/>
+    </w:p>
+    <w:p>
+      <w:pPr>
         <w:rPr>
           <w:b/>
           <w:bCs/>
         </w:rPr>
-        <w:t xml:space="preserve">Why </w:t>
-      </w:r>
-      <w:proofErr w:type="gramStart"/>
+      </w:pPr>
       <w:r>
         <w:rPr>
           <w:b/>
           <w:bCs/>
         </w:rPr>
-        <w:t>it is</w:t>
-      </w:r>
-      <w:proofErr w:type="gramEnd"/>
-      <w:r>
+        <w:t>Description</w:t>
+      </w:r>
+    </w:p>
+    <w:p>
+      <w:r>
+        <w:t xml:space="preserve">Django manages authentication state on the server using its default database session backend. Its default session cookie is </w:t>
+      </w:r>
+      <w:proofErr w:type="spellStart"/>
+      <w:r>
+        <w:t>HttpOnly</w:t>
+      </w:r>
+      <w:proofErr w:type="spellEnd"/>
+      <w:r>
+        <w:t xml:space="preserve">, preventing direct JavaScript access. DRF session authentication, explicit login CSRF protection, and a CSRF token endpoint support the browser client. </w:t>
+      </w:r>
+    </w:p>
+    <w:p>
+      <w:pPr>
         <w:rPr>
           <w:b/>
           <w:bCs/>
         </w:rPr>
-        <w:t xml:space="preserve"> the right choice for </w:t>
-      </w:r>
-      <w:proofErr w:type="spellStart"/>
+      </w:pPr>
       <w:r>
         <w:rPr>
           <w:b/>
           <w:bCs/>
         </w:rPr>
-        <w:t>RightQueue</w:t>
-      </w:r>
-      <w:proofErr w:type="spellEnd"/>
-    </w:p>
-    <w:p>
-      <w:r>
-        <w:lastRenderedPageBreak/>
-        <w:t>The existing route structure keeps public pages and authenticated requester pages understandable and can expand to staff pages later.</w:t>
-      </w:r>
-    </w:p>
-    <w:p>
-      <w:pPr>
-        <w:pStyle w:val="Heading1"/>
-      </w:pPr>
-      <w:bookmarkStart w:id="12" w:name="_Toc241931954"/>
-      <w:r>
-        <w:t>13. Django session authentication with CSRF protection</w:t>
-      </w:r>
-      <w:bookmarkEnd w:id="12"/>
+        <w:t>Key Strengths</w:t>
+      </w:r>
+    </w:p>
+    <w:p>
+      <w:pPr>
+        <w:pStyle w:val="ListBullet"/>
+      </w:pPr>
+      <w:r>
+        <w:t>Keeps session data under server control and supports logout invalidation.</w:t>
+      </w:r>
+    </w:p>
+    <w:p>
+      <w:pPr>
+        <w:pStyle w:val="ListBullet"/>
+      </w:pPr>
+      <w:r>
+        <w:t>CSRF checks protect unsafe requests that use automatically sent browser cookies.</w:t>
+      </w:r>
     </w:p>
     <w:p>
       <w:pPr>
@@ -4449,53 +4159,23 @@
           <w:b/>
           <w:bCs/>
         </w:rPr>
-        <w:t>Description</w:t>
-      </w:r>
-    </w:p>
-    <w:p>
-      <w:r>
-        <w:t xml:space="preserve">Django manages authentication state on the server using its default database session backend. Its default session cookie is </w:t>
-      </w:r>
-      <w:proofErr w:type="spellStart"/>
-      <w:r>
-        <w:t>HttpOnly</w:t>
-      </w:r>
-      <w:proofErr w:type="spellEnd"/>
-      <w:r>
-        <w:t xml:space="preserve">, preventing direct JavaScript access. DRF session authentication, explicit login CSRF protection, and a CSRF token endpoint support the browser client. See </w:t>
-      </w:r>
-      <w:hyperlink r:id="rId26">
-        <w:r>
-          <w:rPr>
-            <w:color w:val="24527A"/>
-          </w:rPr>
-          <w:t>authentication views</w:t>
-        </w:r>
-      </w:hyperlink>
-      <w:r>
-        <w:t xml:space="preserve">, </w:t>
-      </w:r>
-      <w:hyperlink r:id="rId27">
-        <w:r>
-          <w:rPr>
-            <w:color w:val="24527A"/>
-          </w:rPr>
-          <w:t>settings</w:t>
-        </w:r>
-      </w:hyperlink>
-      <w:r>
-        <w:t xml:space="preserve">, and </w:t>
-      </w:r>
-      <w:hyperlink r:id="rId28">
-        <w:r>
-          <w:rPr>
-            <w:color w:val="24527A"/>
-          </w:rPr>
-          <w:t>frontend authentication calls</w:t>
-        </w:r>
-      </w:hyperlink>
-      <w:r>
-        <w:t>.</w:t>
+        <w:t>Weaknesses</w:t>
+      </w:r>
+    </w:p>
+    <w:p>
+      <w:pPr>
+        <w:pStyle w:val="ListBullet"/>
+      </w:pPr>
+      <w:r>
+        <w:t>Requires coordinated cookie, origin, credential, and CSRF settings.</w:t>
+      </w:r>
+    </w:p>
+    <w:p>
+      <w:pPr>
+        <w:pStyle w:val="ListBullet"/>
+      </w:pPr>
+      <w:r>
+        <w:t>Shared session storage and cookie policies need attention when deployment changes.</w:t>
       </w:r>
     </w:p>
     <w:p>
@@ -4510,7 +4190,7 @@
           <w:b/>
           <w:bCs/>
         </w:rPr>
-        <w:t>Positive sides</w:t>
+        <w:t>Mitigation</w:t>
       </w:r>
     </w:p>
     <w:p>
@@ -4518,7 +4198,7 @@
         <w:pStyle w:val="ListBullet"/>
       </w:pPr>
       <w:r>
-        <w:t>Keeps session data under server control and supports logout invalidation.</w:t>
+        <w:t>The shared client includes credentials and CSRF headers; login refreshes the token after rotation.</w:t>
       </w:r>
     </w:p>
     <w:p>
@@ -4526,7 +4206,29 @@
         <w:pStyle w:val="ListBullet"/>
       </w:pPr>
       <w:r>
-        <w:t>CSRF checks protect unsafe requests that use automatically sent browser cookies.</w:t>
+        <w:t>Authentication tests explicitly enforce CSRF checks.</w:t>
+      </w:r>
+    </w:p>
+    <w:p>
+      <w:pPr>
+        <w:pStyle w:val="ListBullet"/>
+      </w:pPr>
+      <w:r>
+        <w:rPr>
+          <w:b/>
+        </w:rPr>
+        <w:t>Planned:</w:t>
+      </w:r>
+      <w:r>
+        <w:t xml:space="preserve"> configure HTTPS and Secure cookies, review </w:t>
+      </w:r>
+      <w:proofErr w:type="spellStart"/>
+      <w:r>
+        <w:t>SameSite</w:t>
+      </w:r>
+      <w:proofErr w:type="spellEnd"/>
+      <w:r>
+        <w:t xml:space="preserve"> behavior, and replace development security settings before deployment. Secure cookie flags are not enabled in the current settings.</w:t>
       </w:r>
     </w:p>
     <w:p>
@@ -4541,7 +4243,7 @@
           <w:b/>
           <w:bCs/>
         </w:rPr>
-        <w:t>Negative sides</w:t>
+        <w:t>Alternatives considered</w:t>
       </w:r>
     </w:p>
     <w:p>
@@ -4549,15 +4251,7 @@
         <w:pStyle w:val="ListBullet"/>
       </w:pPr>
       <w:r>
-        <w:t>Requires coordinated cookie, origin, credential, and CSRF settings.</w:t>
-      </w:r>
-    </w:p>
-    <w:p>
-      <w:pPr>
-        <w:pStyle w:val="ListBullet"/>
-      </w:pPr>
-      <w:r>
-        <w:t>Shared session storage and cookie policies need attention when deployment changes.</w:t>
+        <w:t>Token or JWT authentication can suit mobile and third-party clients, but requires suitable token storage, expiry, and revocation design. It is not inherently less secure.</w:t>
       </w:r>
     </w:p>
     <w:p>
@@ -4572,132 +4266,186 @@
           <w:b/>
           <w:bCs/>
         </w:rPr>
-        <w:t>Mitigation</w:t>
-      </w:r>
-    </w:p>
-    <w:p>
-      <w:pPr>
-        <w:pStyle w:val="ListBullet"/>
-      </w:pPr>
-      <w:r>
-        <w:t>The shared client includes credentials and CSRF headers; login refreshes the token after rotation.</w:t>
-      </w:r>
-    </w:p>
-    <w:p>
-      <w:pPr>
-        <w:pStyle w:val="ListBullet"/>
-      </w:pPr>
-      <w:r>
-        <w:t>Authentication tests explicitly enforce CSRF checks.</w:t>
-      </w:r>
-    </w:p>
-    <w:p>
-      <w:pPr>
-        <w:pStyle w:val="ListBullet"/>
-      </w:pPr>
-      <w:r>
-        <w:rPr>
-          <w:b/>
-        </w:rPr>
-        <w:t>Planned:</w:t>
-      </w:r>
-      <w:r>
-        <w:t xml:space="preserve"> configure HTTPS and Secure cookies, review </w:t>
+        <w:t xml:space="preserve">Why it is the right choice for </w:t>
       </w:r>
       <w:proofErr w:type="spellStart"/>
       <w:r>
-        <w:t>SameSite</w:t>
-      </w:r>
-      <w:proofErr w:type="spellEnd"/>
-      <w:r>
-        <w:t xml:space="preserve"> behavior, and replace development security settings before deployment. Secure cookie flags are not enabled in the current settings.</w:t>
-      </w:r>
-    </w:p>
-    <w:p>
-      <w:pPr>
         <w:rPr>
           <w:b/>
           <w:bCs/>
         </w:rPr>
-      </w:pPr>
-      <w:r>
+        <w:t>RightQueue</w:t>
+      </w:r>
+      <w:proofErr w:type="spellEnd"/>
+    </w:p>
+    <w:p>
+      <w:r>
+        <w:t>The first MVP is a browser application with a Django backend. Sessions reuse integrated authentication without introducing a separate token lifecycle, while CSRF protection addresses cookie-based request risks.</w:t>
+      </w:r>
+    </w:p>
+    <w:p>
+      <w:pPr>
+        <w:pStyle w:val="Heading1"/>
+      </w:pPr>
+      <w:bookmarkStart w:id="13" w:name="_Toc241931955"/>
+      <w:r>
+        <w:t xml:space="preserve">14. </w:t>
+      </w:r>
+      <w:proofErr w:type="spellStart"/>
+      <w:r>
+        <w:t>django</w:t>
+      </w:r>
+      <w:proofErr w:type="spellEnd"/>
+      <w:r>
+        <w:t>-environ for environment-based configuration</w:t>
+      </w:r>
+      <w:bookmarkEnd w:id="13"/>
+    </w:p>
+    <w:p>
+      <w:pPr>
         <w:rPr>
           <w:b/>
           <w:bCs/>
         </w:rPr>
-        <w:t>Alternatives considered</w:t>
-      </w:r>
-    </w:p>
-    <w:p>
-      <w:pPr>
-        <w:pStyle w:val="ListBullet"/>
-      </w:pPr>
-      <w:r>
-        <w:t>Token or JWT authentication can suit mobile and third-party clients, but requires suitable token storage, expiry, and revocation design. It is not inherently less secure.</w:t>
-      </w:r>
-    </w:p>
-    <w:p>
-      <w:pPr>
+      </w:pPr>
+      <w:r>
         <w:rPr>
           <w:b/>
           <w:bCs/>
         </w:rPr>
-      </w:pPr>
-      <w:r>
+        <w:t>Description</w:t>
+      </w:r>
+    </w:p>
+    <w:p>
+      <w:proofErr w:type="spellStart"/>
+      <w:r>
+        <w:rPr>
+          <w:rFonts w:ascii="Consolas" w:hAnsi="Consolas"/>
+          <w:sz w:val="19"/>
+        </w:rPr>
+        <w:t>django</w:t>
+      </w:r>
+      <w:proofErr w:type="spellEnd"/>
+      <w:r>
+        <w:rPr>
+          <w:rFonts w:ascii="Consolas" w:hAnsi="Consolas"/>
+          <w:sz w:val="19"/>
+        </w:rPr>
+        <w:t>-environ</w:t>
+      </w:r>
+      <w:r>
+        <w:t xml:space="preserve"> is a configuration library. </w:t>
+      </w:r>
+      <w:proofErr w:type="spellStart"/>
+      <w:r>
+        <w:t>RightQueue</w:t>
+      </w:r>
+      <w:proofErr w:type="spellEnd"/>
+      <w:r>
+        <w:t xml:space="preserve"> uses it to read a backend </w:t>
+      </w:r>
+      <w:r>
+        <w:rPr>
+          <w:rFonts w:ascii="Consolas" w:hAnsi="Consolas"/>
+          <w:sz w:val="19"/>
+        </w:rPr>
+        <w:t>.env</w:t>
+      </w:r>
+      <w:r>
+        <w:t xml:space="preserve"> file, parse </w:t>
+      </w:r>
+      <w:r>
+        <w:rPr>
+          <w:rFonts w:ascii="Consolas" w:hAnsi="Consolas"/>
+          <w:sz w:val="19"/>
+        </w:rPr>
+        <w:t>DATABASE_URL</w:t>
+      </w:r>
+      <w:r>
+        <w:t xml:space="preserve">, and configure host and origin lists. </w:t>
+      </w:r>
+    </w:p>
+    <w:p>
+      <w:pPr>
         <w:rPr>
           <w:b/>
           <w:bCs/>
         </w:rPr>
-        <w:t xml:space="preserve">Why </w:t>
-      </w:r>
-      <w:proofErr w:type="gramStart"/>
+      </w:pPr>
       <w:r>
         <w:rPr>
           <w:b/>
           <w:bCs/>
         </w:rPr>
-        <w:t>it is</w:t>
-      </w:r>
-      <w:proofErr w:type="gramEnd"/>
-      <w:r>
+        <w:t>Key Strengths</w:t>
+      </w:r>
+    </w:p>
+    <w:p>
+      <w:pPr>
+        <w:pStyle w:val="ListBullet"/>
+      </w:pPr>
+      <w:r>
+        <w:t>Allows database connections and allowed origins to vary between environments.</w:t>
+      </w:r>
+    </w:p>
+    <w:p>
+      <w:pPr>
+        <w:pStyle w:val="ListBullet"/>
+      </w:pPr>
+      <w:r>
+        <w:t>Provides structured parsing instead of repeated manual environment handling.</w:t>
+      </w:r>
+    </w:p>
+    <w:p>
+      <w:pPr>
         <w:rPr>
           <w:b/>
           <w:bCs/>
         </w:rPr>
-        <w:t xml:space="preserve"> the right choice for </w:t>
-      </w:r>
-      <w:proofErr w:type="spellStart"/>
+      </w:pPr>
       <w:r>
         <w:rPr>
           <w:b/>
           <w:bCs/>
         </w:rPr>
-        <w:t>RightQueue</w:t>
-      </w:r>
-      <w:proofErr w:type="spellEnd"/>
-    </w:p>
-    <w:p>
-      <w:r>
-        <w:t>The first MVP is a browser application with a Django backend. Sessions reuse integrated authentication without introducing a separate token lifecycle, while CSRF protection addresses cookie-based request risks.</w:t>
-      </w:r>
-    </w:p>
-    <w:p>
-      <w:pPr>
-        <w:pStyle w:val="Heading1"/>
-      </w:pPr>
-      <w:bookmarkStart w:id="13" w:name="_Toc241931955"/>
-      <w:r>
-        <w:t xml:space="preserve">14. </w:t>
-      </w:r>
-      <w:proofErr w:type="spellStart"/>
-      <w:r>
-        <w:t>django</w:t>
-      </w:r>
-      <w:proofErr w:type="spellEnd"/>
-      <w:r>
-        <w:t>-environ for environment-based configuration</w:t>
-      </w:r>
-      <w:bookmarkEnd w:id="13"/>
+        <w:t>Weaknesses</w:t>
+      </w:r>
+    </w:p>
+    <w:p>
+      <w:pPr>
+        <w:pStyle w:val="ListBullet"/>
+      </w:pPr>
+      <w:r>
+        <w:t>Missing or incorrect values can prevent startup or break browser communication.</w:t>
+      </w:r>
+    </w:p>
+    <w:p>
+      <w:pPr>
+        <w:pStyle w:val="ListBullet"/>
+      </w:pPr>
+      <w:r>
+        <w:t xml:space="preserve">Adoption is incomplete: </w:t>
+      </w:r>
+      <w:r>
+        <w:rPr>
+          <w:rFonts w:ascii="Consolas" w:hAnsi="Consolas"/>
+          <w:sz w:val="19"/>
+        </w:rPr>
+        <w:t>SECRET_KEY</w:t>
+      </w:r>
+      <w:r>
+        <w:t xml:space="preserve"> and </w:t>
+      </w:r>
+      <w:r>
+        <w:rPr>
+          <w:rFonts w:ascii="Consolas" w:hAnsi="Consolas"/>
+          <w:sz w:val="19"/>
+        </w:rPr>
+        <w:t>DEBUG</w:t>
+      </w:r>
+      <w:r>
+        <w:t xml:space="preserve"> remain hardcoded, despite CI supplying environment variables for them.</w:t>
+      </w:r>
     </w:p>
     <w:p>
       <w:pPr>
@@ -4711,67 +4459,204 @@
           <w:b/>
           <w:bCs/>
         </w:rPr>
-        <w:t>Description</w:t>
-      </w:r>
-    </w:p>
-    <w:p>
+        <w:t>Mitigation</w:t>
+      </w:r>
+    </w:p>
+    <w:p>
+      <w:pPr>
+        <w:pStyle w:val="ListBullet"/>
+      </w:pPr>
+      <w:r>
+        <w:t>CI supplies database and host values and runs Django configuration checks.</w:t>
+      </w:r>
+    </w:p>
+    <w:p>
+      <w:pPr>
+        <w:pStyle w:val="ListBullet"/>
+      </w:pPr>
+      <w:r>
+        <w:rPr>
+          <w:b/>
+        </w:rPr>
+        <w:t>Planned:</w:t>
+      </w:r>
+      <w:r>
+        <w:t xml:space="preserve"> move remaining security settings to environment configuration and document required values without committing secrets.</w:t>
+      </w:r>
+    </w:p>
+    <w:p>
+      <w:pPr>
+        <w:rPr>
+          <w:b/>
+          <w:bCs/>
+        </w:rPr>
+      </w:pPr>
+      <w:r>
+        <w:rPr>
+          <w:b/>
+          <w:bCs/>
+        </w:rPr>
+        <w:t>Alternatives considered</w:t>
+      </w:r>
+    </w:p>
+    <w:p>
+      <w:pPr>
+        <w:pStyle w:val="ListBullet"/>
+      </w:pPr>
+      <w:r>
+        <w:t xml:space="preserve">Python's </w:t>
+      </w:r>
       <w:proofErr w:type="spellStart"/>
       <w:r>
         <w:rPr>
           <w:rFonts w:ascii="Consolas" w:hAnsi="Consolas"/>
           <w:sz w:val="19"/>
         </w:rPr>
-        <w:t>django</w:t>
+        <w:t>os.environ</w:t>
       </w:r>
       <w:proofErr w:type="spellEnd"/>
+      <w:r>
+        <w:t xml:space="preserve"> avoids a dependency but needs manual parsing and defaults.</w:t>
+      </w:r>
+    </w:p>
+    <w:p>
+      <w:pPr>
+        <w:pStyle w:val="ListBullet"/>
+      </w:pPr>
       <w:r>
         <w:rPr>
           <w:rFonts w:ascii="Consolas" w:hAnsi="Consolas"/>
           <w:sz w:val="19"/>
         </w:rPr>
-        <w:t>-environ</w:t>
-      </w:r>
-      <w:r>
-        <w:t xml:space="preserve"> is a configuration library. </w:t>
+        <w:t>python-</w:t>
       </w:r>
       <w:proofErr w:type="spellStart"/>
-      <w:r>
-        <w:t>RightQueue</w:t>
-      </w:r>
-      <w:proofErr w:type="spellEnd"/>
-      <w:r>
-        <w:t xml:space="preserve"> uses it to read a backend </w:t>
-      </w:r>
       <w:r>
         <w:rPr>
           <w:rFonts w:ascii="Consolas" w:hAnsi="Consolas"/>
           <w:sz w:val="19"/>
         </w:rPr>
-        <w:t>.env</w:t>
-      </w:r>
-      <w:r>
-        <w:t xml:space="preserve"> file, parse </w:t>
-      </w:r>
+        <w:t>dotenv</w:t>
+      </w:r>
+      <w:proofErr w:type="spellEnd"/>
+      <w:r>
+        <w:t xml:space="preserve"> loads environment files but needs additional handling for database URLs and typed values.</w:t>
+      </w:r>
+    </w:p>
+    <w:p>
+      <w:pPr>
+        <w:rPr>
+          <w:b/>
+          <w:bCs/>
+        </w:rPr>
+      </w:pPr>
+      <w:r>
+        <w:rPr>
+          <w:b/>
+          <w:bCs/>
+        </w:rPr>
+        <w:t xml:space="preserve">Why it is the right choice for </w:t>
+      </w:r>
+      <w:proofErr w:type="spellStart"/>
+      <w:r>
+        <w:rPr>
+          <w:b/>
+          <w:bCs/>
+        </w:rPr>
+        <w:t>RightQueue</w:t>
+      </w:r>
+      <w:proofErr w:type="spellEnd"/>
+    </w:p>
+    <w:p>
+      <w:r>
+        <w:lastRenderedPageBreak/>
+        <w:t>The same backend needs different database and browser origins in development and CI. Central parsing keeps these settings manageable as deployment is introduced.</w:t>
+      </w:r>
+    </w:p>
+    <w:p>
+      <w:pPr>
+        <w:pStyle w:val="Heading1"/>
+      </w:pPr>
+      <w:bookmarkStart w:id="14" w:name="_Toc241931956"/>
+      <w:r>
+        <w:t xml:space="preserve">15. </w:t>
+      </w:r>
+      <w:proofErr w:type="spellStart"/>
+      <w:r>
+        <w:t>django</w:t>
+      </w:r>
+      <w:proofErr w:type="spellEnd"/>
+      <w:r>
+        <w:t>-</w:t>
+      </w:r>
+      <w:proofErr w:type="spellStart"/>
+      <w:r>
+        <w:t>cors</w:t>
+      </w:r>
+      <w:proofErr w:type="spellEnd"/>
+      <w:r>
+        <w:t>-headers for controlled frontend and backend communication</w:t>
+      </w:r>
+      <w:bookmarkEnd w:id="14"/>
+    </w:p>
+    <w:p>
+      <w:pPr>
+        <w:rPr>
+          <w:b/>
+          <w:bCs/>
+        </w:rPr>
+      </w:pPr>
+      <w:r>
+        <w:rPr>
+          <w:b/>
+          <w:bCs/>
+        </w:rPr>
+        <w:t>Description</w:t>
+      </w:r>
+    </w:p>
+    <w:p>
+      <w:proofErr w:type="spellStart"/>
       <w:r>
         <w:rPr>
           <w:rFonts w:ascii="Consolas" w:hAnsi="Consolas"/>
           <w:sz w:val="19"/>
         </w:rPr>
-        <w:t>DATABASE_URL</w:t>
-      </w:r>
-      <w:r>
-        <w:t xml:space="preserve">, and configure host and origin lists. See </w:t>
-      </w:r>
-      <w:hyperlink r:id="rId29">
-        <w:r>
-          <w:rPr>
-            <w:color w:val="24527A"/>
-          </w:rPr>
-          <w:t>settings</w:t>
-        </w:r>
-      </w:hyperlink>
-      <w:r>
-        <w:t>.</w:t>
+        <w:t>django</w:t>
+      </w:r>
+      <w:proofErr w:type="spellEnd"/>
+      <w:r>
+        <w:rPr>
+          <w:rFonts w:ascii="Consolas" w:hAnsi="Consolas"/>
+          <w:sz w:val="19"/>
+        </w:rPr>
+        <w:t>-</w:t>
+      </w:r>
+      <w:proofErr w:type="spellStart"/>
+      <w:r>
+        <w:rPr>
+          <w:rFonts w:ascii="Consolas" w:hAnsi="Consolas"/>
+          <w:sz w:val="19"/>
+        </w:rPr>
+        <w:t>cors</w:t>
+      </w:r>
+      <w:proofErr w:type="spellEnd"/>
+      <w:r>
+        <w:rPr>
+          <w:rFonts w:ascii="Consolas" w:hAnsi="Consolas"/>
+          <w:sz w:val="19"/>
+        </w:rPr>
+        <w:t>-headers</w:t>
+      </w:r>
+      <w:r>
+        <w:t xml:space="preserve"> is Django middleware for Cross-Origin Resource Sharing (CORS). </w:t>
+      </w:r>
+      <w:proofErr w:type="spellStart"/>
+      <w:r>
+        <w:t>RightQueue</w:t>
+      </w:r>
+      <w:proofErr w:type="spellEnd"/>
+      <w:r>
+        <w:t xml:space="preserve"> permits configured frontend origins and credentialed browser requests. CSRF trusted origins are configured separately. </w:t>
       </w:r>
     </w:p>
     <w:p>
@@ -4786,7 +4671,7 @@
           <w:b/>
           <w:bCs/>
         </w:rPr>
-        <w:t>Positive sides</w:t>
+        <w:t>Key Strengths</w:t>
       </w:r>
     </w:p>
     <w:p>
@@ -4794,15 +4679,7 @@
         <w:pStyle w:val="ListBullet"/>
       </w:pPr>
       <w:r>
-        <w:t xml:space="preserve">Allows database connections and </w:t>
-      </w:r>
-      <w:proofErr w:type="gramStart"/>
-      <w:r>
-        <w:t>allowed</w:t>
-      </w:r>
-      <w:proofErr w:type="gramEnd"/>
-      <w:r>
-        <w:t xml:space="preserve"> origins to vary between environments.</w:t>
+        <w:t>Supports the frontend development server calling the separate Django API.</w:t>
       </w:r>
     </w:p>
     <w:p>
@@ -4810,7 +4687,7 @@
         <w:pStyle w:val="ListBullet"/>
       </w:pPr>
       <w:r>
-        <w:t>Provides structured parsing instead of repeated manual environment handling.</w:t>
+        <w:t>Limits which browser origins receive permission to read credentialed responses.</w:t>
       </w:r>
     </w:p>
     <w:p>
@@ -4825,7 +4702,7 @@
           <w:b/>
           <w:bCs/>
         </w:rPr>
-        <w:t>Negative sides</w:t>
+        <w:t>Weaknesses</w:t>
       </w:r>
     </w:p>
     <w:p>
@@ -4833,7 +4710,7 @@
         <w:pStyle w:val="ListBullet"/>
       </w:pPr>
       <w:r>
-        <w:t>Missing or incorrect values can prevent startup or break browser communication.</w:t>
+        <w:t>Incorrect origin settings can break login or permit unintended browser access.</w:t>
       </w:r>
     </w:p>
     <w:p>
@@ -4841,27 +4718,7 @@
         <w:pStyle w:val="ListBullet"/>
       </w:pPr>
       <w:r>
-        <w:t xml:space="preserve">Adoption is incomplete: </w:t>
-      </w:r>
-      <w:r>
-        <w:rPr>
-          <w:rFonts w:ascii="Consolas" w:hAnsi="Consolas"/>
-          <w:sz w:val="19"/>
-        </w:rPr>
-        <w:t>SECRET_KEY</w:t>
-      </w:r>
-      <w:r>
-        <w:t xml:space="preserve"> and </w:t>
-      </w:r>
-      <w:r>
-        <w:rPr>
-          <w:rFonts w:ascii="Consolas" w:hAnsi="Consolas"/>
-          <w:sz w:val="19"/>
-        </w:rPr>
-        <w:t>DEBUG</w:t>
-      </w:r>
-      <w:r>
-        <w:t xml:space="preserve"> remain hardcoded, despite CI supplying environment variables for them.</w:t>
+        <w:t>CORS is not authentication, authorization, or a replacement for CSRF protection.</w:t>
       </w:r>
     </w:p>
     <w:p>
@@ -4884,15 +4741,7 @@
         <w:pStyle w:val="ListBullet"/>
       </w:pPr>
       <w:r>
-        <w:t xml:space="preserve">CI supplies </w:t>
-      </w:r>
-      <w:proofErr w:type="gramStart"/>
-      <w:r>
-        <w:t>database</w:t>
-      </w:r>
-      <w:proofErr w:type="gramEnd"/>
-      <w:r>
-        <w:t xml:space="preserve"> and host values and runs Django configuration checks.</w:t>
+        <w:t>Use explicit origin lists and tests for configured and unconfigured origins.</w:t>
       </w:r>
     </w:p>
     <w:p>
@@ -4906,7 +4755,7 @@
         <w:t>Planned:</w:t>
       </w:r>
       <w:r>
-        <w:t xml:space="preserve"> move remaining security settings to environment configuration and document required values without committing secrets.</w:t>
+        <w:t xml:space="preserve"> review CORS and CSRF origin lists together for each deployment.</w:t>
       </w:r>
     </w:p>
     <w:p>
@@ -4929,29 +4778,7 @@
         <w:pStyle w:val="ListBullet"/>
       </w:pPr>
       <w:r>
-        <w:t xml:space="preserve">Python's </w:t>
-      </w:r>
-      <w:proofErr w:type="spellStart"/>
-      <w:proofErr w:type="gramStart"/>
-      <w:r>
-        <w:rPr>
-          <w:rFonts w:ascii="Consolas" w:hAnsi="Consolas"/>
-          <w:sz w:val="19"/>
-        </w:rPr>
-        <w:t>os.environ</w:t>
-      </w:r>
-      <w:proofErr w:type="spellEnd"/>
-      <w:proofErr w:type="gramEnd"/>
-      <w:r>
-        <w:t xml:space="preserve"> avoids </w:t>
-      </w:r>
-      <w:proofErr w:type="gramStart"/>
-      <w:r>
-        <w:t>a dependency</w:t>
-      </w:r>
-      <w:proofErr w:type="gramEnd"/>
-      <w:r>
-        <w:t xml:space="preserve"> but needs manual parsing and defaults.</w:t>
+        <w:t>Serving frontend and API through one origin avoids CORS for that browser deployment but requires routing or proxy configuration.</w:t>
       </w:r>
     </w:p>
     <w:p>
@@ -4959,23 +4786,7 @@
         <w:pStyle w:val="ListBullet"/>
       </w:pPr>
       <w:r>
-        <w:rPr>
-          <w:rFonts w:ascii="Consolas" w:hAnsi="Consolas"/>
-          <w:sz w:val="19"/>
-        </w:rPr>
-        <w:t>python-</w:t>
-      </w:r>
-      <w:proofErr w:type="spellStart"/>
-      <w:r>
-        <w:rPr>
-          <w:rFonts w:ascii="Consolas" w:hAnsi="Consolas"/>
-          <w:sz w:val="19"/>
-        </w:rPr>
-        <w:t>dotenv</w:t>
-      </w:r>
-      <w:proofErr w:type="spellEnd"/>
-      <w:r>
-        <w:t xml:space="preserve"> loads environment files but needs additional handling for database URLs and typed values.</w:t>
+        <w:t>Custom CORS middleware offers control but duplicates established header and preflight handling.</w:t>
       </w:r>
     </w:p>
     <w:p>
@@ -4990,385 +4801,61 @@
           <w:b/>
           <w:bCs/>
         </w:rPr>
-        <w:lastRenderedPageBreak/>
-        <w:t xml:space="preserve">Why </w:t>
-      </w:r>
-      <w:proofErr w:type="gramStart"/>
+        <w:t xml:space="preserve">Why it is the right choice for </w:t>
+      </w:r>
+      <w:proofErr w:type="spellStart"/>
       <w:r>
         <w:rPr>
           <w:b/>
           <w:bCs/>
         </w:rPr>
-        <w:t>it is</w:t>
-      </w:r>
-      <w:proofErr w:type="gramEnd"/>
-      <w:r>
+        <w:t>RightQueue</w:t>
+      </w:r>
+      <w:proofErr w:type="spellEnd"/>
+    </w:p>
+    <w:p>
+      <w:r>
+        <w:t>It supports the current separate frontend and backend development setup while retaining explicit browser origin controls for session-based requests.</w:t>
+      </w:r>
+    </w:p>
+    <w:p>
+      <w:pPr>
+        <w:pStyle w:val="Heading1"/>
+      </w:pPr>
+      <w:bookmarkStart w:id="15" w:name="_Toc241931957"/>
+      <w:r>
+        <w:t>16. Automated testing and continuous integration</w:t>
+      </w:r>
+      <w:bookmarkEnd w:id="15"/>
+    </w:p>
+    <w:p>
+      <w:pPr>
         <w:rPr>
           <w:b/>
           <w:bCs/>
         </w:rPr>
-        <w:t xml:space="preserve"> the right choice for </w:t>
-      </w:r>
-      <w:proofErr w:type="spellStart"/>
+      </w:pPr>
       <w:r>
         <w:rPr>
           <w:b/>
           <w:bCs/>
         </w:rPr>
-        <w:t>RightQueue</w:t>
+        <w:t>Description</w:t>
+      </w:r>
+    </w:p>
+    <w:p>
+      <w:r>
+        <w:t xml:space="preserve">Django's test framework and DRF's API test client cover backend models, submission services, authentication, and permissions. GitHub Actions runs backend checks and tests against PostgreSQL, plus frontend </w:t>
+      </w:r>
+      <w:proofErr w:type="spellStart"/>
+      <w:r>
+        <w:t>ESLint</w:t>
       </w:r>
       <w:proofErr w:type="spellEnd"/>
-    </w:p>
-    <w:p>
-      <w:r>
-        <w:t>The same backend needs different database and browser origins in development and CI. Central parsing keeps these settings manageable as deployment is introduced.</w:t>
-      </w:r>
-    </w:p>
-    <w:p>
-      <w:pPr>
-        <w:pStyle w:val="Heading1"/>
-      </w:pPr>
-      <w:bookmarkStart w:id="14" w:name="_Toc241931956"/>
-      <w:r>
-        <w:t xml:space="preserve">15. </w:t>
-      </w:r>
-      <w:proofErr w:type="spellStart"/>
-      <w:r>
-        <w:t>django</w:t>
-      </w:r>
-      <w:proofErr w:type="spellEnd"/>
-      <w:r>
-        <w:t>-</w:t>
-      </w:r>
-      <w:proofErr w:type="spellStart"/>
-      <w:r>
-        <w:t>cors</w:t>
-      </w:r>
-      <w:proofErr w:type="spellEnd"/>
-      <w:r>
-        <w:t>-headers for controlled frontend and backend communication</w:t>
-      </w:r>
-      <w:bookmarkEnd w:id="14"/>
-    </w:p>
-    <w:p>
-      <w:pPr>
-        <w:rPr>
-          <w:b/>
-          <w:bCs/>
-        </w:rPr>
-      </w:pPr>
-      <w:r>
-        <w:rPr>
-          <w:b/>
-          <w:bCs/>
-        </w:rPr>
-        <w:t>Description</w:t>
-      </w:r>
-    </w:p>
-    <w:p>
-      <w:proofErr w:type="spellStart"/>
-      <w:r>
-        <w:rPr>
-          <w:rFonts w:ascii="Consolas" w:hAnsi="Consolas"/>
-          <w:sz w:val="19"/>
-        </w:rPr>
-        <w:t>django</w:t>
-      </w:r>
-      <w:proofErr w:type="spellEnd"/>
-      <w:r>
-        <w:rPr>
-          <w:rFonts w:ascii="Consolas" w:hAnsi="Consolas"/>
-          <w:sz w:val="19"/>
-        </w:rPr>
-        <w:t>-</w:t>
-      </w:r>
-      <w:proofErr w:type="spellStart"/>
-      <w:r>
-        <w:rPr>
-          <w:rFonts w:ascii="Consolas" w:hAnsi="Consolas"/>
-          <w:sz w:val="19"/>
-        </w:rPr>
-        <w:t>cors</w:t>
-      </w:r>
-      <w:proofErr w:type="spellEnd"/>
-      <w:r>
-        <w:rPr>
-          <w:rFonts w:ascii="Consolas" w:hAnsi="Consolas"/>
-          <w:sz w:val="19"/>
-        </w:rPr>
-        <w:t>-headers</w:t>
-      </w:r>
-      <w:r>
-        <w:t xml:space="preserve"> is Django middleware for Cross-Origin Resource Sharing (CORS). </w:t>
-      </w:r>
-      <w:proofErr w:type="spellStart"/>
-      <w:r>
-        <w:t>RightQueue</w:t>
-      </w:r>
-      <w:proofErr w:type="spellEnd"/>
-      <w:r>
-        <w:t xml:space="preserve"> permits configured frontend origins and credentialed browser requests. CSRF trusted origins are configured separately. See </w:t>
-      </w:r>
-      <w:hyperlink r:id="rId30">
-        <w:r>
-          <w:rPr>
-            <w:color w:val="24527A"/>
-          </w:rPr>
-          <w:t>settings</w:t>
-        </w:r>
-      </w:hyperlink>
-      <w:r>
-        <w:t xml:space="preserve"> and </w:t>
-      </w:r>
-      <w:hyperlink r:id="rId31">
-        <w:r>
-          <w:rPr>
-            <w:color w:val="24527A"/>
-          </w:rPr>
-          <w:t>origin tests</w:t>
-        </w:r>
-      </w:hyperlink>
-      <w:r>
-        <w:t>.</w:t>
-      </w:r>
-    </w:p>
-    <w:p>
-      <w:pPr>
-        <w:rPr>
-          <w:b/>
-          <w:bCs/>
-        </w:rPr>
-      </w:pPr>
-      <w:r>
-        <w:rPr>
-          <w:b/>
-          <w:bCs/>
-        </w:rPr>
-        <w:t>Positive sides</w:t>
-      </w:r>
-    </w:p>
-    <w:p>
-      <w:pPr>
-        <w:pStyle w:val="ListBullet"/>
-      </w:pPr>
-      <w:r>
-        <w:t>Supports the frontend development server calling the separate Django API.</w:t>
-      </w:r>
-    </w:p>
-    <w:p>
-      <w:pPr>
-        <w:pStyle w:val="ListBullet"/>
-      </w:pPr>
-      <w:r>
-        <w:t>Limits which browser origins receive permission to read credentialed responses.</w:t>
-      </w:r>
-    </w:p>
-    <w:p>
-      <w:pPr>
-        <w:rPr>
-          <w:b/>
-          <w:bCs/>
-        </w:rPr>
-      </w:pPr>
-      <w:r>
-        <w:rPr>
-          <w:b/>
-          <w:bCs/>
-        </w:rPr>
-        <w:t>Negative sides</w:t>
-      </w:r>
-    </w:p>
-    <w:p>
-      <w:pPr>
-        <w:pStyle w:val="ListBullet"/>
-      </w:pPr>
-      <w:r>
-        <w:t>Incorrect origin settings can break login or permit unintended browser access.</w:t>
-      </w:r>
-    </w:p>
-    <w:p>
-      <w:pPr>
-        <w:pStyle w:val="ListBullet"/>
-      </w:pPr>
-      <w:r>
-        <w:t>CORS is not authentication, authorization, or a replacement for CSRF protection.</w:t>
-      </w:r>
-    </w:p>
-    <w:p>
-      <w:pPr>
-        <w:rPr>
-          <w:b/>
-          <w:bCs/>
-        </w:rPr>
-      </w:pPr>
-      <w:r>
-        <w:rPr>
-          <w:b/>
-          <w:bCs/>
-        </w:rPr>
-        <w:t>Mitigation</w:t>
-      </w:r>
-    </w:p>
-    <w:p>
-      <w:pPr>
-        <w:pStyle w:val="ListBullet"/>
-      </w:pPr>
-      <w:r>
-        <w:t>Use explicit origin lists and tests for configured and unconfigured origins.</w:t>
-      </w:r>
-    </w:p>
-    <w:p>
-      <w:pPr>
-        <w:pStyle w:val="ListBullet"/>
-      </w:pPr>
-      <w:r>
-        <w:rPr>
-          <w:b/>
-        </w:rPr>
-        <w:t>Planned:</w:t>
-      </w:r>
-      <w:r>
-        <w:t xml:space="preserve"> review CORS and CSRF origin </w:t>
-      </w:r>
-      <w:proofErr w:type="gramStart"/>
-      <w:r>
-        <w:t>lists</w:t>
-      </w:r>
-      <w:proofErr w:type="gramEnd"/>
-      <w:r>
-        <w:t xml:space="preserve"> together for each deployment.</w:t>
-      </w:r>
-    </w:p>
-    <w:p>
-      <w:pPr>
-        <w:rPr>
-          <w:b/>
-          <w:bCs/>
-        </w:rPr>
-      </w:pPr>
-      <w:r>
-        <w:rPr>
-          <w:b/>
-          <w:bCs/>
-        </w:rPr>
-        <w:t>Alternatives considered</w:t>
-      </w:r>
-    </w:p>
-    <w:p>
-      <w:pPr>
-        <w:pStyle w:val="ListBullet"/>
-      </w:pPr>
-      <w:r>
-        <w:t>Serving frontend and API through one origin avoids CORS for that browser deployment but requires routing or proxy configuration.</w:t>
-      </w:r>
-    </w:p>
-    <w:p>
-      <w:pPr>
-        <w:pStyle w:val="ListBullet"/>
-      </w:pPr>
-      <w:r>
-        <w:t xml:space="preserve">Custom CORS middleware offers </w:t>
-      </w:r>
-      <w:proofErr w:type="gramStart"/>
-      <w:r>
-        <w:t>control</w:t>
-      </w:r>
-      <w:proofErr w:type="gramEnd"/>
-      <w:r>
-        <w:t xml:space="preserve"> but duplicates established header and </w:t>
-      </w:r>
-      <w:proofErr w:type="gramStart"/>
-      <w:r>
-        <w:t>preflight</w:t>
-      </w:r>
-      <w:proofErr w:type="gramEnd"/>
-      <w:r>
-        <w:t xml:space="preserve"> handling.</w:t>
-      </w:r>
-    </w:p>
-    <w:p>
-      <w:pPr>
-        <w:rPr>
-          <w:b/>
-          <w:bCs/>
-        </w:rPr>
-      </w:pPr>
-      <w:r>
-        <w:rPr>
-          <w:b/>
-          <w:bCs/>
-        </w:rPr>
-        <w:t xml:space="preserve">Why </w:t>
-      </w:r>
-      <w:proofErr w:type="gramStart"/>
-      <w:r>
-        <w:rPr>
-          <w:b/>
-          <w:bCs/>
-        </w:rPr>
-        <w:t>it is</w:t>
-      </w:r>
-      <w:proofErr w:type="gramEnd"/>
-      <w:r>
-        <w:rPr>
-          <w:b/>
-          <w:bCs/>
-        </w:rPr>
-        <w:t xml:space="preserve"> the right choice for </w:t>
-      </w:r>
-      <w:proofErr w:type="spellStart"/>
-      <w:r>
-        <w:rPr>
-          <w:b/>
-          <w:bCs/>
-        </w:rPr>
-        <w:t>RightQueue</w:t>
-      </w:r>
-      <w:proofErr w:type="spellEnd"/>
-    </w:p>
-    <w:p>
-      <w:r>
-        <w:t>It supports the current separate frontend and backend development setup while retaining explicit browser origin controls for session-based requests.</w:t>
-      </w:r>
-    </w:p>
-    <w:p>
-      <w:pPr>
-        <w:pStyle w:val="Heading1"/>
-      </w:pPr>
-      <w:bookmarkStart w:id="15" w:name="_Toc241931957"/>
-      <w:r>
-        <w:t>16. Automated testing and continuous integration</w:t>
-      </w:r>
-      <w:bookmarkEnd w:id="15"/>
-    </w:p>
-    <w:p>
-      <w:pPr>
-        <w:rPr>
-          <w:b/>
-          <w:bCs/>
-        </w:rPr>
-      </w:pPr>
-      <w:r>
-        <w:rPr>
-          <w:b/>
-          <w:bCs/>
-        </w:rPr>
-        <w:t>Description</w:t>
-      </w:r>
-    </w:p>
-    <w:p>
-      <w:r>
-        <w:t xml:space="preserve">Django's test framework and DRF's API test client cover backend models, submission services, authentication, and permissions. GitHub Actions runs backend checks and tests against PostgreSQL, plus frontend </w:t>
-      </w:r>
-      <w:proofErr w:type="spellStart"/>
-      <w:r>
-        <w:t>ESLint</w:t>
-      </w:r>
-      <w:proofErr w:type="spellEnd"/>
       <w:r>
         <w:t xml:space="preserve"> checks and a TypeScript/Vite build. These are development tools and practices, not runtime architecture components. See </w:t>
       </w:r>
-      <w:hyperlink r:id="rId32">
+      <w:hyperlink r:id="rId13">
         <w:r>
           <w:rPr>
             <w:color w:val="24527A"/>
@@ -5379,7 +4866,7 @@
       <w:r>
         <w:t xml:space="preserve"> and </w:t>
       </w:r>
-      <w:hyperlink r:id="rId33">
+      <w:hyperlink r:id="rId14">
         <w:r>
           <w:rPr>
             <w:color w:val="24527A"/>
@@ -5403,7 +4890,7 @@
           <w:b/>
           <w:bCs/>
         </w:rPr>
-        <w:t>Positive sides</w:t>
+        <w:t>Key Strengths</w:t>
       </w:r>
     </w:p>
     <w:p>
@@ -5434,7 +4921,7 @@
           <w:b/>
           <w:bCs/>
         </w:rPr>
-        <w:t>Negative sides</w:t>
+        <w:t>Weaknesses</w:t>
       </w:r>
     </w:p>
     <w:p>
@@ -5550,37 +5037,21 @@
           <w:b/>
           <w:bCs/>
         </w:rPr>
-        <w:lastRenderedPageBreak/>
-        <w:t xml:space="preserve">Why </w:t>
-      </w:r>
-      <w:proofErr w:type="gramStart"/>
+        <w:t xml:space="preserve">Why it is the right choice for </w:t>
+      </w:r>
+      <w:proofErr w:type="spellStart"/>
       <w:r>
         <w:rPr>
           <w:b/>
           <w:bCs/>
         </w:rPr>
-        <w:t>it is</w:t>
-      </w:r>
-      <w:proofErr w:type="gramEnd"/>
-      <w:r>
-        <w:rPr>
-          <w:b/>
-          <w:bCs/>
-        </w:rPr>
-        <w:t xml:space="preserve"> the right choice for </w:t>
-      </w:r>
-      <w:proofErr w:type="spellStart"/>
-      <w:r>
-        <w:rPr>
-          <w:b/>
-          <w:bCs/>
-        </w:rPr>
         <w:t>RightQueue</w:t>
       </w:r>
       <w:proofErr w:type="spellEnd"/>
     </w:p>
     <w:p>
       <w:r>
+        <w:lastRenderedPageBreak/>
         <w:t>Built-in backend testing and the existing CI workflow provide a manageable way to protect organization boundaries and request integrity during student development.</w:t>
       </w:r>
     </w:p>
@@ -5692,7 +5163,7 @@
     <w:p>
       <w:pPr>
         <w:sectPr>
-          <w:footerReference w:type="default" r:id="rId34"/>
+          <w:footerReference w:type="default" r:id="rId15"/>
           <w:pgSz w:w="11909" w:h="16834"/>
           <w:pgMar w:top="1008" w:right="1080" w:bottom="1008" w:left="1080" w:header="720" w:footer="720" w:gutter="0"/>
           <w:cols w:space="720"/>
@@ -6572,19 +6043,11 @@
             <w:pPr>
               <w:spacing w:after="0" w:line="240" w:lineRule="auto"/>
             </w:pPr>
-            <w:proofErr w:type="gramStart"/>
             <w:r>
               <w:rPr>
                 <w:sz w:val="18"/>
               </w:rPr>
-              <w:t>Checks uses</w:t>
-            </w:r>
-            <w:proofErr w:type="gramEnd"/>
-            <w:r>
-              <w:rPr>
-                <w:sz w:val="18"/>
-              </w:rPr>
-              <w:t xml:space="preserve"> of declared API types</w:t>
+              <w:t>Checks uses of declared API types</w:t>
             </w:r>
           </w:p>
         </w:tc>

</xml_diff>